<commit_message>
Add change in Second part
</commit_message>
<xml_diff>
--- a/srw.docx
+++ b/srw.docx
@@ -2037,34 +2037,7 @@
         <w:t xml:space="preserve"> </w:t>
       </w:r>
       <w:r>
-        <w:t xml:space="preserve">Опыт – вот за чем приходит игрок. Уникальный игровой опыт, который одни готовы получать в качестве хобби, развлечения в свободный пятничный вечер, а другие целенаправленно готовы выделить несколько часов в выходные дни для того, чтобы с головой окунуться в другой мир. </w:t>
-      </w:r>
-      <w:r>
-        <w:t xml:space="preserve">Разработчику игр или инди-студии важно дать игроку то, за чем он приходит. Кроме приятных глазу визуальных составляющих и затягивающих сюжетов, игрока увлекает непосредственно управление в игре. Если оно будет не интуитивным, мало </w:t>
-      </w:r>
-      <w:r>
-        <w:t>под</w:t>
-      </w:r>
-      <w:r>
-        <w:t xml:space="preserve">контрольным, то игрок не сможет задержаться в игре надолго. </w:t>
-      </w:r>
-      <w:r>
-        <w:t>Создать игру с откликающимся управлением можно, используя современные игровые движки. Но</w:t>
-      </w:r>
-      <w:r>
-        <w:t xml:space="preserve"> </w:t>
-      </w:r>
-      <w:r>
-        <w:t xml:space="preserve">сможет </w:t>
-      </w:r>
-      <w:r>
-        <w:t>ли игровой</w:t>
-      </w:r>
-      <w:r>
-        <w:t xml:space="preserve"> движок взять на себя все особенности управлени</w:t>
-      </w:r>
-      <w:r>
-        <w:t>я персонажем?</w:t>
+        <w:t>Опыт – вот за чем приходит игрок. Уникальный игровой опыт, который одни готовы получать в качестве хобби, развлечения в свободный пятничный вечер, а другие целенаправленно готовы выделить несколько часов в выходные дни для того, чтобы с головой окунуться в другой мир. Разработчику игр или инди-студии важно дать игроку то, за чем он приходит. Кроме приятных глазу визуальных составляющих и затягивающих сюжетов, игрока увлекает непосредственно управление в игре. Если оно будет не интуитивным, мало подконтрольным, то игрок не сможет задержаться в игре надолго. Создать игру с откликающимся управлением можно, используя современные игровые движки. Но сможет ли игровой движок взять на себя все особенности управления персонажем?</w:t>
       </w:r>
     </w:p>
     <w:p>
@@ -2091,61 +2064,19 @@
         <w:rPr>
           <w:szCs w:val="28"/>
         </w:rPr>
-        <w:t xml:space="preserve">: </w:t>
+        <w:t>: создание модуля управления персонажем на основе пользовательской физики</w:t>
       </w:r>
       <w:r>
         <w:rPr>
           <w:szCs w:val="28"/>
         </w:rPr>
-        <w:t xml:space="preserve">создание </w:t>
+        <w:t xml:space="preserve"> </w:t>
       </w:r>
       <w:r>
         <w:rPr>
           <w:szCs w:val="28"/>
         </w:rPr>
-        <w:t>модуля</w:t>
-      </w:r>
-      <w:r>
-        <w:rPr>
-          <w:szCs w:val="28"/>
-        </w:rPr>
-        <w:t xml:space="preserve"> </w:t>
-      </w:r>
-      <w:r>
-        <w:rPr>
-          <w:szCs w:val="28"/>
-        </w:rPr>
-        <w:t>управления персонаж</w:t>
-      </w:r>
-      <w:r>
-        <w:rPr>
-          <w:szCs w:val="28"/>
-        </w:rPr>
-        <w:t>ем</w:t>
-      </w:r>
-      <w:r>
-        <w:rPr>
-          <w:szCs w:val="28"/>
-        </w:rPr>
-        <w:t xml:space="preserve"> на основе пользовательской физики</w:t>
-      </w:r>
-      <w:r>
-        <w:rPr>
-          <w:szCs w:val="28"/>
-        </w:rPr>
-        <w:t xml:space="preserve"> </w:t>
-      </w:r>
-      <w:r>
-        <w:rPr>
-          <w:szCs w:val="28"/>
-        </w:rPr>
-        <w:t xml:space="preserve">в </w:t>
-      </w:r>
-      <w:r>
-        <w:rPr>
-          <w:szCs w:val="28"/>
-        </w:rPr>
-        <w:t xml:space="preserve">прототипе </w:t>
+        <w:t xml:space="preserve">в прототипе </w:t>
       </w:r>
       <w:r>
         <w:rPr>
@@ -2170,19 +2101,7 @@
         <w:rPr>
           <w:szCs w:val="28"/>
         </w:rPr>
-        <w:t>платформер</w:t>
-      </w:r>
-      <w:r>
-        <w:rPr>
-          <w:szCs w:val="28"/>
-        </w:rPr>
-        <w:t>а</w:t>
-      </w:r>
-      <w:r>
-        <w:rPr>
-          <w:szCs w:val="28"/>
-        </w:rPr>
-        <w:t>.</w:t>
+        <w:t>платформера.</w:t>
       </w:r>
     </w:p>
     <w:p>
@@ -2316,13 +2235,7 @@
         <w:rPr>
           <w:szCs w:val="28"/>
         </w:rPr>
-        <w:t>-платформере на основе пользовательской физики</w:t>
-      </w:r>
-      <w:r>
-        <w:rPr>
-          <w:szCs w:val="28"/>
-        </w:rPr>
-        <w:t>.</w:t>
+        <w:t>-платформере на основе пользовательской физики.</w:t>
       </w:r>
     </w:p>
     <w:p>
@@ -2336,13 +2249,7 @@
       <w:bookmarkStart w:id="1" w:name="_Toc185945899"/>
       <w:r>
         <w:lastRenderedPageBreak/>
-        <w:t>Актуальность</w:t>
-      </w:r>
-      <w:r>
-        <w:t xml:space="preserve"> </w:t>
-      </w:r>
-      <w:r>
-        <w:t>жанра платформер</w:t>
+        <w:t>Актуальность жанра платформер</w:t>
       </w:r>
       <w:bookmarkEnd w:id="1"/>
     </w:p>
@@ -2365,31 +2272,7 @@
     <w:p>
       <w:r>
         <w:tab/>
-        <w:t xml:space="preserve">Данный </w:t>
-      </w:r>
-      <w:r>
-        <w:t xml:space="preserve">жанр </w:t>
-      </w:r>
-      <w:r>
-        <w:t xml:space="preserve">является одним из самых полюбившихся многим игрокам еще со времен первых </w:t>
-      </w:r>
-      <w:r>
-        <w:t>компьютерных игр. Поэтому так важно, чтобы у</w:t>
-      </w:r>
-      <w:r>
-        <w:t>правление персонажем в платформере</w:t>
-      </w:r>
-      <w:r>
-        <w:t xml:space="preserve"> </w:t>
-      </w:r>
-      <w:r>
-        <w:t>бы</w:t>
-      </w:r>
-      <w:r>
-        <w:t>ло</w:t>
-      </w:r>
-      <w:r>
-        <w:t xml:space="preserve"> точным, отзывчивым и интуитивно понятным. </w:t>
+        <w:t xml:space="preserve">Данный жанр является одним из самых полюбившихся многим игрокам еще со времен первых компьютерных игр. Поэтому так важно, чтобы управление персонажем в платформере было точным, отзывчивым и интуитивно понятным. </w:t>
       </w:r>
     </w:p>
     <w:p>
@@ -2442,10 +2325,7 @@
     <w:p>
       <w:r>
         <w:tab/>
-        <w:t>Р</w:t>
-      </w:r>
-      <w:r>
-        <w:t>ассмотрим примеры трех самых показательных в удобстве управления персонажем игр.</w:t>
+        <w:t>Рассмотрим примеры трех самых показательных в удобстве управления персонажем игр.</w:t>
       </w:r>
     </w:p>
     <w:p>
@@ -2551,8 +2431,6 @@
     <w:p>
       <w:r>
         <w:tab/>
-      </w:r>
-      <w:r>
         <w:t>Потенциальные ограничения:</w:t>
       </w:r>
     </w:p>
@@ -2573,34 +2451,18 @@
         <w:t>Ограниченные возможности</w:t>
       </w:r>
       <w:r>
-        <w:t xml:space="preserve">: Управление Марио может показаться ограниченным по сравнению с современными играми, так как оно не включает дополнительные механики, такие как рывок или </w:t>
-      </w:r>
-      <w:r>
-        <w:t xml:space="preserve">возможность </w:t>
-      </w:r>
-      <w:r>
-        <w:t>цепля</w:t>
-      </w:r>
-      <w:r>
-        <w:t>ться</w:t>
-      </w:r>
-      <w:r>
-        <w:t xml:space="preserve"> за стены.</w:t>
-      </w:r>
-    </w:p>
-    <w:p>
-      <w:r>
-        <w:t xml:space="preserve">   </w:t>
-      </w:r>
-      <w:r>
-        <w:t xml:space="preserve">Заметка </w:t>
-      </w:r>
-      <w:r>
-        <w:t>для проектирования</w:t>
-      </w:r>
+        <w:t>: Управление Марио может показаться ограниченным по сравнению с современными играми, так как оно не включает дополнительные механики, такие как рывок или возможность цепляться за стены.</w:t>
+      </w:r>
+    </w:p>
+    <w:p>
+      <w:r>
+        <w:t xml:space="preserve">   Заметка для проектирования</w:t>
+      </w:r>
+      <w:proofErr w:type="gramStart"/>
       <w:r>
         <w:t>: Важно</w:t>
       </w:r>
+      <w:proofErr w:type="gramEnd"/>
       <w:r>
         <w:t xml:space="preserve"> обеспечить плавность и предсказуемость движений персонажа, а также мгновенную реакцию на команды игрока.</w:t>
       </w:r>
@@ -2655,8 +2517,6 @@
     <w:p>
       <w:r>
         <w:tab/>
-      </w:r>
-      <w:r>
         <w:t>Особенности управления:</w:t>
       </w:r>
     </w:p>
@@ -2783,12 +2643,7 @@
       </w:pPr>
       <w:r>
         <w:tab/>
-      </w:r>
-      <w:r>
-        <w:t>Заметка</w:t>
-      </w:r>
-      <w:r>
-        <w:t xml:space="preserve"> для проектирования: Введение дополнительных механик, таких как рывок, может значительно обогатить игровой процесс, если они реализованы с высокой точностью и отзывчивостью.</w:t>
+        <w:t>Заметка для проектирования: Введение дополнительных механик, таких как рывок, может значительно обогатить игровой процесс, если они реализованы с высокой точностью и отзывчивостью.</w:t>
       </w:r>
     </w:p>
     <w:p/>
@@ -2838,8 +2693,6 @@
     <w:p>
       <w:r>
         <w:tab/>
-      </w:r>
-      <w:r>
         <w:t>Особенности управления:</w:t>
       </w:r>
     </w:p>
@@ -2932,22 +2785,20 @@
     <w:p>
       <w:r>
         <w:tab/>
-      </w:r>
-      <w:r>
-        <w:t>Заметка</w:t>
-      </w:r>
-      <w:r>
-        <w:t xml:space="preserve"> </w:t>
-      </w:r>
-      <w:r>
-        <w:t>для проектирования: Важно обеспечить плавность и предсказуемость движений персонажа, а также мгновенную реакцию на команды игрока. Введение инерции и трения может значительно улучшить реалистичность и удобство управления.</w:t>
+        <w:t>Заметка для проектирования</w:t>
+      </w:r>
+      <w:proofErr w:type="gramStart"/>
+      <w:r>
+        <w:t>: Важно</w:t>
+      </w:r>
+      <w:proofErr w:type="gramEnd"/>
+      <w:r>
+        <w:t xml:space="preserve"> обеспечить плавность и предсказуемость движений персонажа, а также мгновенную реакцию на команды игрока. Введение инерции и трения может значительно улучшить реалистичность и удобство управления.</w:t>
       </w:r>
     </w:p>
     <w:p>
       <w:r>
         <w:tab/>
-      </w:r>
-      <w:r>
         <w:t xml:space="preserve">Анализ и проектирование механики управления в платформерах требует внимательного подхода к настройке физических параметров и взаимодействия с окружением. Примеры игр, таких как Super </w:t>
       </w:r>
       <w:proofErr w:type="spellStart"/>
@@ -2988,13 +2839,7 @@
       </w:r>
       <w:bookmarkStart w:id="4" w:name="_Toc185945902"/>
       <w:r>
-        <w:t>Концепция прототипа</w:t>
-      </w:r>
-      <w:r>
-        <w:t xml:space="preserve"> модуля</w:t>
-      </w:r>
-      <w:r>
-        <w:t xml:space="preserve"> управления персонажем</w:t>
+        <w:t>Концепция прототипа модуля управления персонажем</w:t>
       </w:r>
       <w:bookmarkEnd w:id="4"/>
     </w:p>
@@ -3016,32 +2861,110 @@
       </w:r>
     </w:p>
     <w:p>
+      <w:pPr>
+        <w:pStyle w:val="ac"/>
+      </w:pPr>
+      <w:r>
+        <w:t>На основе концепции были выделены основные сущности и составлена модель предметной области.</w:t>
+      </w:r>
+    </w:p>
+    <w:p>
+      <w:pPr>
+        <w:jc w:val="center"/>
+      </w:pPr>
+      <w:r>
+        <w:rPr>
+          <w:noProof/>
+        </w:rPr>
+        <w:drawing>
+          <wp:inline distT="0" distB="0" distL="0" distR="0" wp14:anchorId="0312763A" wp14:editId="2A30021F">
+            <wp:extent cx="4868333" cy="3787985"/>
+            <wp:effectExtent l="0" t="0" r="0" b="0"/>
+            <wp:docPr id="1865399118" name="Рисунок 1"/>
+            <wp:cNvGraphicFramePr>
+              <a:graphicFrameLocks xmlns:a="http://schemas.openxmlformats.org/drawingml/2006/main" noChangeAspect="1"/>
+            </wp:cNvGraphicFramePr>
+            <a:graphic xmlns:a="http://schemas.openxmlformats.org/drawingml/2006/main">
+              <a:graphicData uri="http://schemas.openxmlformats.org/drawingml/2006/picture">
+                <pic:pic xmlns:pic="http://schemas.openxmlformats.org/drawingml/2006/picture">
+                  <pic:nvPicPr>
+                    <pic:cNvPr id="1865399118" name=""/>
+                    <pic:cNvPicPr/>
+                  </pic:nvPicPr>
+                  <pic:blipFill>
+                    <a:blip r:embed="rId8"/>
+                    <a:stretch>
+                      <a:fillRect/>
+                    </a:stretch>
+                  </pic:blipFill>
+                  <pic:spPr>
+                    <a:xfrm>
+                      <a:off x="0" y="0"/>
+                      <a:ext cx="4933305" cy="3838539"/>
+                    </a:xfrm>
+                    <a:prstGeom prst="rect">
+                      <a:avLst/>
+                    </a:prstGeom>
+                  </pic:spPr>
+                </pic:pic>
+              </a:graphicData>
+            </a:graphic>
+          </wp:inline>
+        </w:drawing>
+      </w:r>
+    </w:p>
+    <w:p>
+      <w:pPr>
+        <w:pStyle w:val="ab"/>
+        <w:jc w:val="center"/>
+        <w:rPr>
+          <w:i w:val="0"/>
+          <w:iCs w:val="0"/>
+        </w:rPr>
+      </w:pPr>
       <w:r>
         <w:tab/>
       </w:r>
       <w:r>
-        <w:t xml:space="preserve">Поскольку </w:t>
-      </w:r>
-      <w:r>
-        <w:t>целью модуля является управлени</w:t>
-      </w:r>
-      <w:r>
-        <w:t>е</w:t>
-      </w:r>
-      <w:r>
-        <w:t xml:space="preserve"> персонажем, то на текущем этапе сущности, из которых будет состоять модель предметной области: игрок и платформы.</w:t>
+        <w:rPr>
+          <w:i w:val="0"/>
+          <w:iCs w:val="0"/>
+        </w:rPr>
+        <w:t xml:space="preserve">Рисунок </w:t>
+      </w:r>
+      <w:r>
+        <w:rPr>
+          <w:i w:val="0"/>
+          <w:iCs w:val="0"/>
+        </w:rPr>
+        <w:t>1</w:t>
+      </w:r>
+      <w:r>
+        <w:rPr>
+          <w:i w:val="0"/>
+          <w:iCs w:val="0"/>
+        </w:rPr>
+        <w:t xml:space="preserve">. </w:t>
+      </w:r>
+      <w:r>
+        <w:rPr>
+          <w:i w:val="0"/>
+          <w:iCs w:val="0"/>
+        </w:rPr>
+        <w:t>Модель предметной области</w:t>
       </w:r>
     </w:p>
     <w:p>
       <w:r>
         <w:tab/>
-        <w:t xml:space="preserve">Сущность игрока представляет собой основного персонажа, которым управляет </w:t>
-      </w:r>
-      <w:r>
-        <w:t>пользователь</w:t>
-      </w:r>
-      <w:r>
-        <w:t>. Эта сущность включает в себя все параметры и механики, необходимые для управления персонажем, такие как скорость, сила прыжка, инерция и взаимодействие с окружением.</w:t>
+        <w:t>Поскольку целью модуля является управление персонажем, то на текущем этапе сущности, из которых будет состоять модель предметной области: игрок и платформы.</w:t>
+      </w:r>
+    </w:p>
+    <w:p>
+      <w:r>
+        <w:lastRenderedPageBreak/>
+        <w:tab/>
+        <w:t>Сущность игрока представляет собой основного персонажа, которым управляет пользователь. Эта сущность включает в себя все параметры и механики, необходимые для управления персонажем, такие как скорость, сила прыжка, инерция и взаимодействие с окружением.</w:t>
       </w:r>
     </w:p>
     <w:p>
@@ -3052,53 +2975,35 @@
       </w:pPr>
       <w:r>
         <w:tab/>
-      </w:r>
-      <w:r>
         <w:t>Платформы представляют собой статические или динамические объекты, на которых персонаж может стоять, прыгать и взаимодействовать. Платформы могут иметь различные свойства, такие как трение, подвижность и размеры.</w:t>
       </w:r>
     </w:p>
     <w:p>
       <w:r>
         <w:tab/>
-        <w:t xml:space="preserve">Названные </w:t>
-      </w:r>
-      <w:r>
-        <w:t>сущност</w:t>
-      </w:r>
-      <w:r>
-        <w:t>и в игровом пространстве сталкиваются и взаимодействуют.</w:t>
-      </w:r>
-      <w:r>
-        <w:t xml:space="preserve"> Далее разберем основные взаимодействия.</w:t>
+        <w:t>Названные сущности в игровом пространстве сталкиваются и взаимодействуют. Далее разберем основные взаимодействия.</w:t>
       </w:r>
     </w:p>
     <w:p>
       <w:r>
         <w:tab/>
-      </w:r>
-      <w:r>
         <w:t>Обработка столкновений: Прототип должен включать точную и предсказуемую обработку столкновений между сущностью игрока и объектами платформ. Это позволяет оценить, насколько корректно персонаж взаимодействует с окружением.</w:t>
       </w:r>
     </w:p>
     <w:p>
       <w:r>
         <w:tab/>
-      </w:r>
-      <w:r>
         <w:t>Трение и скольжение: Введение трения для создания более реалистичного движения по поверхностям. Трение может варьироваться в зависимости от типа поверхности (например, лед или земля).</w:t>
       </w:r>
     </w:p>
     <w:p>
       <w:r>
-        <w:lastRenderedPageBreak/>
         <w:t>Движение и прыжки</w:t>
       </w:r>
     </w:p>
     <w:p>
       <w:r>
         <w:tab/>
-      </w:r>
-      <w:r>
         <w:t>Гравитация и прыжки: Гравитация и сила прыжка должны быть настроены таким образом, чтобы движения персонажа выглядели реалистично и были удобны для управления.</w:t>
       </w:r>
     </w:p>
@@ -3122,10 +3027,7 @@
         <w:ind w:firstLine="709"/>
       </w:pPr>
       <w:r>
-        <w:t xml:space="preserve">На основе концепции игры были выделены следующие основные механики: </w:t>
-      </w:r>
-      <w:r>
-        <w:t>передвижение по платформам, прыжок, рывок. В зависимости от того, в каких условиях находится игровой персонаж, данные механики будут варьироваться. Например, по платформам, имитирующим материал лёд, игрок будет двигаться с большим скольжением, чем по платформам, имитирующим материал земли. Также сам жанр включает в себя особенности управления, которые я далее более подробно рассматриваю.</w:t>
+        <w:t>На основе концепции игры были выделены следующие основные механики: передвижение по платформам, прыжок, рывок. В зависимости от того, в каких условиях находится игровой персонаж, данные механики будут варьироваться. Например, по платформам, имитирующим материал лёд, игрок будет двигаться с большим скольжением, чем по платформам, имитирующим материал земли. Также сам жанр включает в себя особенности управления, которые я далее более подробно рассматриваю.</w:t>
       </w:r>
     </w:p>
     <w:p>
@@ -3133,28 +3035,8 @@
         <w:ind w:firstLine="709"/>
       </w:pPr>
       <w:r>
-        <w:t>Управление в прыжке</w:t>
-      </w:r>
-      <w:r>
-        <w:t>.</w:t>
-      </w:r>
-      <w:r>
-        <w:t xml:space="preserve"> Игрок должен иметь возможность контролировать персонажа в воздухе, например, изменять направление движения или выполнять дополнительные действия</w:t>
-      </w:r>
-      <w:r>
-        <w:t xml:space="preserve">, </w:t>
-      </w:r>
-      <w:r>
-        <w:t>например, двойной прыжок.</w:t>
-      </w:r>
-      <w:r>
-        <w:t xml:space="preserve"> Для реализации двойного прыжка необходимо встроить буфер прыжков. Количество повторяемых прыжков может быть гораздо </w:t>
-      </w:r>
-      <w:r>
-        <w:t>больше, всё</w:t>
-      </w:r>
-      <w:r>
-        <w:t xml:space="preserve"> зависит от тех условий, в которые мы погружаем игрока, поэтому необходимо встроить универсальный буфер прыжка, чтобы в последствии их количество можно было регулировать.</w:t>
+        <w:lastRenderedPageBreak/>
+        <w:t>Управление в прыжке. Игрок должен иметь возможность контролировать персонажа в воздухе, например, изменять направление движения или выполнять дополнительные действия, например, двойной прыжок. Для реализации двойного прыжка необходимо встроить буфер прыжков. Количество повторяемых прыжков может быть гораздо больше, всё зависит от тех условий, в которые мы погружаем игрока, поэтому необходимо встроить универсальный буфер прыжка, чтобы в последствии их количество можно было регулировать.</w:t>
       </w:r>
     </w:p>
     <w:p>
@@ -3162,13 +3044,7 @@
         <w:ind w:firstLine="709"/>
       </w:pPr>
       <w:r>
-        <w:t>Падение и приземление</w:t>
-      </w:r>
-      <w:r>
-        <w:t>.</w:t>
-      </w:r>
-      <w:r>
-        <w:t xml:space="preserve"> Падение и приземление должны быть плавными и контролируемыми, чтобы игрок мог точно приземляться на платформы. Для прыжка необходимо добавить запоминание нажатия клавиши и таймер прикосновения с платформой. В случае, если игрок нажал на кнопку прыжка чуть раньше приземления, а персонаж не отреагировал на нажатие, то впечатление от управления персонажем испортится, вызвав разногласие ожидаемого и полученного результатов.</w:t>
+        <w:t>Падение и приземление. Падение и приземление должны быть плавными и контролируемыми, чтобы игрок мог точно приземляться на платформы. Для прыжка необходимо добавить запоминание нажатия клавиши и таймер прикосновения с платформой. В случае, если игрок нажал на кнопку прыжка чуть раньше приземления, а персонаж не отреагировал на нажатие, то впечатление от управления персонажем испортится, вызвав разногласие ожидаемого и полученного результатов.</w:t>
       </w:r>
     </w:p>
     <w:p>
@@ -3176,11 +3052,7 @@
         <w:ind w:firstLine="709"/>
       </w:pPr>
       <w:r>
-        <w:t xml:space="preserve">Кроме повторного прыжка при падении, одной из игровых ситуаций может стать прыжок при соскальзывании с платформы. В таком случае </w:t>
-      </w:r>
-      <w:r>
-        <w:lastRenderedPageBreak/>
-        <w:t>необходимо добавить таймер, отмеряющий время после соскальзывания с платформы.</w:t>
+        <w:t>Кроме повторного прыжка при падении, одной из игровых ситуаций может стать прыжок при соскальзывании с платформы. В таком случае необходимо добавить таймер, отмеряющий время после соскальзывания с платформы.</w:t>
       </w:r>
     </w:p>
     <w:p>
@@ -3218,10 +3090,7 @@
         <w:t>интуитивность</w:t>
       </w:r>
       <w:r>
-        <w:t xml:space="preserve"> управления. </w:t>
-      </w:r>
-      <w:r>
-        <w:t>На уровне прототипа достаточно следующего управления:</w:t>
+        <w:t xml:space="preserve"> управления. На уровне прототипа достаточно следующего управления:</w:t>
       </w:r>
     </w:p>
     <w:p>
@@ -3254,10 +3123,7 @@
         </w:numPr>
       </w:pPr>
       <w:r>
-        <w:t xml:space="preserve">Прыжок </w:t>
-      </w:r>
-      <w:r>
-        <w:t xml:space="preserve">пользователь осуществляет с помощью клавиши </w:t>
+        <w:t xml:space="preserve">Прыжок пользователь осуществляет с помощью клавиши </w:t>
       </w:r>
       <w:r>
         <w:rPr>
@@ -3287,6 +3153,7 @@
         </w:numPr>
       </w:pPr>
       <w:r>
+        <w:lastRenderedPageBreak/>
         <w:t xml:space="preserve">Рывок пользователь осуществляет с помощью клавиши </w:t>
       </w:r>
       <w:r>
@@ -3482,13 +3349,7 @@
         <w:ind w:left="567"/>
       </w:pPr>
       <w:r>
-        <w:t>предоставл</w:t>
-      </w:r>
-      <w:r>
-        <w:t>яют</w:t>
-      </w:r>
-      <w:r>
-        <w:t xml:space="preserve"> готовую физику и системы моделирования.</w:t>
+        <w:t>предоставляют готовую физику и системы моделирования.</w:t>
       </w:r>
     </w:p>
     <w:p>
@@ -3527,10 +3388,7 @@
         <w:ind w:left="567"/>
       </w:pPr>
       <w:r>
-        <w:t>кроссплатформенность</w:t>
-      </w:r>
-      <w:r>
-        <w:t xml:space="preserve"> движков позволяет создавать игры для различных устройств.</w:t>
+        <w:t>кроссплатформенность движков позволяет создавать игры для различных устройств.</w:t>
       </w:r>
     </w:p>
     <w:p>
@@ -3601,71 +3459,17 @@
     <w:p>
       <w:r>
         <w:tab/>
-        <w:t>Среди всего предоставляемого выбора игровых движков на рынке нужно определит</w:t>
-      </w:r>
-      <w:r>
-        <w:t>ь</w:t>
-      </w:r>
-      <w:r>
-        <w:t xml:space="preserve">ся, что подойдет для </w:t>
-      </w:r>
-      <w:r>
-        <w:t>меня, как для начинающего разработчика игр</w:t>
-      </w:r>
-      <w:r>
-        <w:t xml:space="preserve">. Возможно создание своего собственного движка, но это очень затратно для </w:t>
-      </w:r>
-      <w:r>
-        <w:t>соло-разработчика</w:t>
-      </w:r>
-      <w:r>
-        <w:t xml:space="preserve">. Также можно рассмотреть опенсорсные варианты движков, код для которых находится в свободном доступе, но для этого необходимы опытные программисты, которые встроят необходимый функционал. Остановимся на готовых игровых движках. </w:t>
+        <w:t xml:space="preserve">Среди всего предоставляемого выбора игровых движков на рынке нужно определиться, что подойдет для меня, как для начинающего разработчика игр. Возможно создание своего собственного движка, но это очень затратно для соло-разработчика. Также можно рассмотреть опенсорсные варианты движков, код для которых находится в свободном доступе, но для этого необходимы опытные программисты, которые встроят необходимый функционал. Остановимся на готовых игровых движках. </w:t>
       </w:r>
     </w:p>
     <w:p>
       <w:r>
         <w:tab/>
-        <w:t xml:space="preserve">Первое, что необходимо учесть, это платформа, под которую будет разрабатываться проект. Существуют движки, </w:t>
-      </w:r>
-      <w:r>
-        <w:t>которые поддерживают</w:t>
-      </w:r>
-      <w:r>
-        <w:t xml:space="preserve"> кроссплатформенную разработку, а есть </w:t>
-      </w:r>
-      <w:r>
-        <w:t xml:space="preserve">те, </w:t>
-      </w:r>
-      <w:r>
-        <w:t xml:space="preserve">которые ориентированы только под </w:t>
+        <w:t xml:space="preserve">Первое, что необходимо учесть, это платформа, под которую будет разрабатываться проект. Существуют движки, которые поддерживают кроссплатформенную разработку, а есть те, которые ориентированы только под </w:t>
       </w:r>
       <w:r>
         <w:lastRenderedPageBreak/>
-        <w:t xml:space="preserve">один тип. Если </w:t>
-      </w:r>
-      <w:r>
-        <w:t xml:space="preserve">необходимо </w:t>
-      </w:r>
-      <w:r>
-        <w:t>созда</w:t>
-      </w:r>
-      <w:r>
-        <w:t>вать</w:t>
-      </w:r>
-      <w:r>
-        <w:t xml:space="preserve"> проекты для мобильных устройств, то им не за чем тратить время на изучение </w:t>
-      </w:r>
-      <w:r>
-        <w:t>кроссплатформенност</w:t>
-      </w:r>
-      <w:r>
-        <w:t>и</w:t>
-      </w:r>
-      <w:r>
-        <w:t xml:space="preserve"> программного обеспечения.</w:t>
-      </w:r>
-      <w:r>
-        <w:t xml:space="preserve"> </w:t>
+        <w:t xml:space="preserve">один тип. Если необходимо создавать проекты для мобильных устройств, то им не за чем тратить время на изучение кроссплатформенности программного обеспечения. </w:t>
       </w:r>
     </w:p>
     <w:p>
@@ -3835,10 +3639,7 @@
     <w:p>
       <w:r>
         <w:tab/>
-        <w:t>Также полезно перед разработкой проекта изучить движки тех игр, которые используются в качестве референса. Возможно, это может стать ключевой причиной, по которой придется выбрать новый игровой движок</w:t>
-      </w:r>
-      <w:r>
-        <w:t>.</w:t>
+        <w:t>Также полезно перед разработкой проекта изучить движки тех игр, которые используются в качестве референса. Возможно, это может стать ключевой причиной, по которой придется выбрать новый игровой движок.</w:t>
       </w:r>
     </w:p>
     <w:p>
@@ -4344,13 +4145,7 @@
               <w:rPr>
                 <w:lang w:eastAsia="ru-RU"/>
               </w:rPr>
-              <w:t>П</w:t>
-            </w:r>
-            <w:r>
-              <w:rPr>
-                <w:lang w:eastAsia="ru-RU"/>
-              </w:rPr>
-              <w:t>лагины и пакеты, з</w:t>
+              <w:t>Плагины и пакеты, з</w:t>
             </w:r>
             <w:r>
               <w:rPr>
@@ -4983,13 +4778,7 @@
         <w:rPr>
           <w:lang w:eastAsia="ru-RU"/>
         </w:rPr>
-        <w:t xml:space="preserve"> платформере</w:t>
-      </w:r>
-      <w:r>
-        <w:rPr>
-          <w:lang w:eastAsia="ru-RU"/>
-        </w:rPr>
-        <w:t xml:space="preserve">, движок </w:t>
+        <w:t xml:space="preserve"> платформере, движок </w:t>
       </w:r>
       <w:r>
         <w:rPr>
@@ -5032,19 +4821,7 @@
         <w:rPr>
           <w:lang w:eastAsia="ru-RU"/>
         </w:rPr>
-        <w:t xml:space="preserve"> функционала</w:t>
-      </w:r>
-      <w:r>
-        <w:rPr>
-          <w:lang w:eastAsia="ru-RU"/>
-        </w:rPr>
-        <w:t>: несмотря</w:t>
-      </w:r>
-      <w:r>
-        <w:rPr>
-          <w:lang w:eastAsia="ru-RU"/>
-        </w:rPr>
-        <w:t xml:space="preserve"> на первоначальную фокусировку на 3</w:t>
+        <w:t xml:space="preserve"> функционала: несмотря на первоначальную фокусировку на 3</w:t>
       </w:r>
       <w:r>
         <w:rPr>
@@ -5185,19 +4962,7 @@
         <w:rPr>
           <w:lang w:eastAsia="ru-RU"/>
         </w:rPr>
-        <w:t xml:space="preserve">позволяет значительно ускорить процесс разработки прототипа. Использование </w:t>
-      </w:r>
-      <w:r>
-        <w:rPr>
-          <w:lang w:eastAsia="ru-RU"/>
-        </w:rPr>
-        <w:t>готовых компонентов</w:t>
-      </w:r>
-      <w:r>
-        <w:rPr>
-          <w:lang w:eastAsia="ru-RU"/>
-        </w:rPr>
-        <w:t xml:space="preserve"> для управления персонажем может сократить время на разработку основных механик игры</w:t>
+        <w:t>позволяет значительно ускорить процесс разработки прототипа. Использование готовых компонентов для управления персонажем может сократить время на разработку основных механик игры</w:t>
       </w:r>
       <w:r>
         <w:rPr>
@@ -5947,7 +5712,7 @@
           <w:noProof/>
         </w:rPr>
         <w:drawing>
-          <wp:inline distT="0" distB="0" distL="0" distR="0" wp14:anchorId="4AEDE0E3" wp14:editId="076CF8C3">
+          <wp:inline distT="0" distB="0" distL="0" distR="0" wp14:anchorId="34B56F9A" wp14:editId="2F8731BA">
             <wp:extent cx="3057714" cy="1808480"/>
             <wp:effectExtent l="0" t="0" r="9525" b="1270"/>
             <wp:docPr id="2" name="Рисунок 2">
@@ -5974,7 +5739,7 @@
                     <pic:cNvPicPr/>
                   </pic:nvPicPr>
                   <pic:blipFill>
-                    <a:blip r:embed="rId8"/>
+                    <a:blip r:embed="rId9"/>
                     <a:stretch>
                       <a:fillRect/>
                     </a:stretch>
@@ -6094,144 +5859,10 @@
           <w:noProof/>
         </w:rPr>
         <w:drawing>
-          <wp:inline distT="0" distB="0" distL="0" distR="0" wp14:anchorId="6ED3E53A" wp14:editId="7A966BBB">
+          <wp:inline distT="0" distB="0" distL="0" distR="0" wp14:anchorId="708B6AAF" wp14:editId="2F88ABAB">
             <wp:extent cx="3371850" cy="1188348"/>
             <wp:effectExtent l="0" t="0" r="0" b="0"/>
             <wp:docPr id="4" name="Рисунок 4"/>
-            <wp:cNvGraphicFramePr>
-              <a:graphicFrameLocks xmlns:a="http://schemas.openxmlformats.org/drawingml/2006/main" noChangeAspect="1"/>
-            </wp:cNvGraphicFramePr>
-            <a:graphic xmlns:a="http://schemas.openxmlformats.org/drawingml/2006/main">
-              <a:graphicData uri="http://schemas.openxmlformats.org/drawingml/2006/picture">
-                <pic:pic xmlns:pic="http://schemas.openxmlformats.org/drawingml/2006/picture">
-                  <pic:nvPicPr>
-                    <pic:cNvPr id="1" name=""/>
-                    <pic:cNvPicPr/>
-                  </pic:nvPicPr>
-                  <pic:blipFill>
-                    <a:blip r:embed="rId9"/>
-                    <a:stretch>
-                      <a:fillRect/>
-                    </a:stretch>
-                  </pic:blipFill>
-                  <pic:spPr>
-                    <a:xfrm>
-                      <a:off x="0" y="0"/>
-                      <a:ext cx="3400716" cy="1198521"/>
-                    </a:xfrm>
-                    <a:prstGeom prst="rect">
-                      <a:avLst/>
-                    </a:prstGeom>
-                  </pic:spPr>
-                </pic:pic>
-              </a:graphicData>
-            </a:graphic>
-          </wp:inline>
-        </w:drawing>
-      </w:r>
-    </w:p>
-    <w:p>
-      <w:pPr>
-        <w:pStyle w:val="ab"/>
-        <w:jc w:val="center"/>
-        <w:rPr>
-          <w:i w:val="0"/>
-          <w:iCs w:val="0"/>
-        </w:rPr>
-      </w:pPr>
-      <w:r>
-        <w:rPr>
-          <w:i w:val="0"/>
-          <w:iCs w:val="0"/>
-        </w:rPr>
-        <w:t xml:space="preserve">Рисунок </w:t>
-      </w:r>
-      <w:r>
-        <w:rPr>
-          <w:i w:val="0"/>
-          <w:iCs w:val="0"/>
-        </w:rPr>
-        <w:t xml:space="preserve">2. </w:t>
-      </w:r>
-      <w:r>
-        <w:rPr>
-          <w:i w:val="0"/>
-          <w:iCs w:val="0"/>
-        </w:rPr>
-        <w:t xml:space="preserve">Игровой объект </w:t>
-      </w:r>
-      <w:r>
-        <w:rPr>
-          <w:i w:val="0"/>
-          <w:iCs w:val="0"/>
-          <w:lang w:val="en-US"/>
-        </w:rPr>
-        <w:t>Player</w:t>
-      </w:r>
-    </w:p>
-    <w:p>
-      <w:pPr>
-        <w:spacing w:after="160"/>
-        <w:ind w:firstLine="360"/>
-      </w:pPr>
-      <w:proofErr w:type="spellStart"/>
-      <w:r>
-        <w:rPr>
-          <w:lang w:val="en-US"/>
-        </w:rPr>
-        <w:t>GameObject</w:t>
-      </w:r>
-      <w:proofErr w:type="spellEnd"/>
-      <w:r>
-        <w:t>'ы организуются в иерархическую структуру, называемую иерархией сцены (</w:t>
-      </w:r>
-      <w:r>
-        <w:rPr>
-          <w:lang w:val="en-US"/>
-        </w:rPr>
-        <w:t>Scene</w:t>
-      </w:r>
-      <w:r>
-        <w:t xml:space="preserve"> </w:t>
-      </w:r>
-      <w:r>
-        <w:rPr>
-          <w:lang w:val="en-US"/>
-        </w:rPr>
-        <w:t>Hierarchy</w:t>
-      </w:r>
-      <w:r>
-        <w:t xml:space="preserve">). Один </w:t>
-      </w:r>
-      <w:proofErr w:type="spellStart"/>
-      <w:r>
-        <w:rPr>
-          <w:lang w:val="en-US"/>
-        </w:rPr>
-        <w:t>GameObject</w:t>
-      </w:r>
-      <w:proofErr w:type="spellEnd"/>
-      <w:r>
-        <w:t xml:space="preserve"> может быть родителем для другого, создавая отношения "родитель-потомок". Это позволяет группировать объекты, управлять ими совместно и создавать сложные составные объекты.</w:t>
-      </w:r>
-    </w:p>
-    <w:p>
-      <w:pPr>
-        <w:keepNext/>
-        <w:spacing w:after="160"/>
-        <w:ind w:firstLine="360"/>
-        <w:jc w:val="center"/>
-      </w:pPr>
-      <w:r>
-        <w:rPr>
-          <w:noProof/>
-        </w:rPr>
-        <w:lastRenderedPageBreak/>
-        <w:drawing>
-          <wp:inline distT="0" distB="0" distL="0" distR="0" wp14:anchorId="6DF0ABB6" wp14:editId="694B7E6D">
-            <wp:extent cx="2308811" cy="2886075"/>
-            <wp:effectExtent l="0" t="0" r="0" b="0"/>
-            <wp:docPr id="3" name="Рисунок 3"/>
             <wp:cNvGraphicFramePr>
               <a:graphicFrameLocks xmlns:a="http://schemas.openxmlformats.org/drawingml/2006/main" noChangeAspect="1"/>
             </wp:cNvGraphicFramePr>
@@ -6251,7 +5882,7 @@
                   <pic:spPr>
                     <a:xfrm>
                       <a:off x="0" y="0"/>
-                      <a:ext cx="2321372" cy="2901777"/>
+                      <a:ext cx="3400716" cy="1198521"/>
                     </a:xfrm>
                     <a:prstGeom prst="rect">
                       <a:avLst/>
@@ -6285,117 +5916,87 @@
           <w:i w:val="0"/>
           <w:iCs w:val="0"/>
         </w:rPr>
-        <w:t>3</w:t>
+        <w:t xml:space="preserve">2. </w:t>
       </w:r>
       <w:r>
         <w:rPr>
           <w:i w:val="0"/>
           <w:iCs w:val="0"/>
         </w:rPr>
-        <w:t xml:space="preserve">. </w:t>
-      </w:r>
-      <w:r>
-        <w:rPr>
-          <w:i w:val="0"/>
-          <w:iCs w:val="0"/>
-        </w:rPr>
-        <w:t xml:space="preserve">Иерархия </w:t>
-      </w:r>
-      <w:proofErr w:type="spellStart"/>
+        <w:t xml:space="preserve">Игровой объект </w:t>
+      </w:r>
       <w:r>
         <w:rPr>
           <w:i w:val="0"/>
           <w:iCs w:val="0"/>
           <w:lang w:val="en-US"/>
         </w:rPr>
+        <w:t>Player</w:t>
+      </w:r>
+    </w:p>
+    <w:p>
+      <w:pPr>
+        <w:spacing w:after="160"/>
+        <w:ind w:firstLine="360"/>
+      </w:pPr>
+      <w:proofErr w:type="spellStart"/>
+      <w:r>
+        <w:rPr>
+          <w:lang w:val="en-US"/>
+        </w:rPr>
         <w:t>GameObject</w:t>
       </w:r>
       <w:proofErr w:type="spellEnd"/>
       <w:r>
-        <w:rPr>
-          <w:i w:val="0"/>
-          <w:iCs w:val="0"/>
-        </w:rPr>
-        <w:t xml:space="preserve"> на сцене</w:t>
-      </w:r>
-    </w:p>
-    <w:p>
-      <w:pPr>
-        <w:ind w:firstLine="708"/>
-      </w:pPr>
+        <w:t>'ы организуются в иерархическую структуру, называемую иерархией сцены (</w:t>
+      </w:r>
+      <w:r>
+        <w:rPr>
+          <w:lang w:val="en-US"/>
+        </w:rPr>
+        <w:t>Scene</w:t>
+      </w:r>
+      <w:r>
+        <w:t xml:space="preserve"> </w:t>
+      </w:r>
+      <w:r>
+        <w:rPr>
+          <w:lang w:val="en-US"/>
+        </w:rPr>
+        <w:t>Hierarchy</w:t>
+      </w:r>
+      <w:r>
+        <w:t xml:space="preserve">). Один </w:t>
+      </w:r>
       <w:proofErr w:type="spellStart"/>
       <w:r>
+        <w:rPr>
+          <w:lang w:val="en-US"/>
+        </w:rPr>
         <w:t>GameObject</w:t>
       </w:r>
       <w:proofErr w:type="spellEnd"/>
       <w:r>
-        <w:t xml:space="preserve"> сам по себе не имеет визуального представления или поведения. Его функциональность определяется компонентами (</w:t>
-      </w:r>
-      <w:proofErr w:type="spellStart"/>
-      <w:r>
-        <w:t>Components</w:t>
-      </w:r>
-      <w:proofErr w:type="spellEnd"/>
-      <w:r>
-        <w:t>), которые прикрепляются к нему. Компоненты – это модульные фрагменты кода, реализующие определенные аспекты объекта.</w:t>
-      </w:r>
-    </w:p>
-    <w:p>
-      <w:r>
-        <w:tab/>
-        <w:t xml:space="preserve">Например, </w:t>
-      </w:r>
-      <w:proofErr w:type="spellStart"/>
-      <w:r>
-        <w:t>Transform</w:t>
-      </w:r>
-      <w:proofErr w:type="spellEnd"/>
-      <w:r>
-        <w:t xml:space="preserve">: Обязательный компонент для каждого </w:t>
-      </w:r>
-      <w:proofErr w:type="spellStart"/>
-      <w:r>
-        <w:t>GameObject</w:t>
-      </w:r>
-      <w:proofErr w:type="spellEnd"/>
-      <w:r>
-        <w:t>, определяющий его положение (</w:t>
-      </w:r>
-      <w:proofErr w:type="spellStart"/>
-      <w:r>
-        <w:t>position</w:t>
-      </w:r>
-      <w:proofErr w:type="spellEnd"/>
-      <w:r>
-        <w:t>), вращение (</w:t>
-      </w:r>
-      <w:proofErr w:type="spellStart"/>
-      <w:r>
-        <w:t>rotation</w:t>
-      </w:r>
-      <w:proofErr w:type="spellEnd"/>
-      <w:r>
-        <w:t>) и масштаб (</w:t>
-      </w:r>
-      <w:proofErr w:type="spellStart"/>
-      <w:r>
-        <w:t>scale</w:t>
-      </w:r>
-      <w:proofErr w:type="spellEnd"/>
-      <w:r>
-        <w:t>) в пространстве сцены.</w:t>
-      </w:r>
-    </w:p>
-    <w:p>
+        <w:t xml:space="preserve"> может быть родителем для другого, создавая отношения "родитель-потомок". Это позволяет группировать объекты, управлять ими совместно и создавать сложные составные объекты.</w:t>
+      </w:r>
+    </w:p>
+    <w:p>
+      <w:pPr>
+        <w:keepNext/>
+        <w:spacing w:after="160"/>
+        <w:ind w:firstLine="360"/>
+        <w:jc w:val="center"/>
+      </w:pPr>
       <w:r>
         <w:rPr>
           <w:noProof/>
         </w:rPr>
+        <w:lastRenderedPageBreak/>
         <w:drawing>
-          <wp:inline distT="0" distB="0" distL="0" distR="0" wp14:anchorId="033A5171" wp14:editId="3831A477">
-            <wp:extent cx="5940425" cy="875030"/>
-            <wp:effectExtent l="0" t="0" r="3175" b="1270"/>
-            <wp:docPr id="5" name="Рисунок 5"/>
+          <wp:inline distT="0" distB="0" distL="0" distR="0" wp14:anchorId="292E8EC6" wp14:editId="7A27F8A0">
+            <wp:extent cx="2308811" cy="2886075"/>
+            <wp:effectExtent l="0" t="0" r="0" b="0"/>
+            <wp:docPr id="3" name="Рисунок 3"/>
             <wp:cNvGraphicFramePr>
               <a:graphicFrameLocks xmlns:a="http://schemas.openxmlformats.org/drawingml/2006/main" noChangeAspect="1"/>
             </wp:cNvGraphicFramePr>
@@ -6415,7 +6016,7 @@
                   <pic:spPr>
                     <a:xfrm>
                       <a:off x="0" y="0"/>
-                      <a:ext cx="5940425" cy="875030"/>
+                      <a:ext cx="2321372" cy="2901777"/>
                     </a:xfrm>
                     <a:prstGeom prst="rect">
                       <a:avLst/>
@@ -6442,44 +6043,80 @@
           <w:i w:val="0"/>
           <w:iCs w:val="0"/>
         </w:rPr>
-        <w:t>Рисунок 4</w:t>
+        <w:t xml:space="preserve">Рисунок </w:t>
       </w:r>
       <w:r>
         <w:rPr>
           <w:i w:val="0"/>
           <w:iCs w:val="0"/>
         </w:rPr>
-        <w:t>.</w:t>
+        <w:t>3</w:t>
       </w:r>
       <w:r>
         <w:rPr>
           <w:i w:val="0"/>
           <w:iCs w:val="0"/>
         </w:rPr>
-        <w:t xml:space="preserve"> Компонент </w:t>
-      </w:r>
-      <w:proofErr w:type="spellStart"/>
+        <w:t xml:space="preserve">. </w:t>
+      </w:r>
       <w:r>
         <w:rPr>
           <w:i w:val="0"/>
           <w:iCs w:val="0"/>
         </w:rPr>
+        <w:t xml:space="preserve">Иерархия </w:t>
+      </w:r>
+      <w:proofErr w:type="spellStart"/>
+      <w:r>
+        <w:rPr>
+          <w:i w:val="0"/>
+          <w:iCs w:val="0"/>
+          <w:lang w:val="en-US"/>
+        </w:rPr>
+        <w:t>GameObject</w:t>
+      </w:r>
+      <w:proofErr w:type="spellEnd"/>
+      <w:r>
+        <w:rPr>
+          <w:i w:val="0"/>
+          <w:iCs w:val="0"/>
+        </w:rPr>
+        <w:t xml:space="preserve"> на сцене</w:t>
+      </w:r>
+    </w:p>
+    <w:p>
+      <w:pPr>
+        <w:ind w:firstLine="708"/>
+      </w:pPr>
+      <w:proofErr w:type="spellStart"/>
+      <w:r>
+        <w:t>GameObject</w:t>
+      </w:r>
+      <w:proofErr w:type="spellEnd"/>
+      <w:r>
+        <w:t xml:space="preserve"> сам по себе не имеет визуального представления или поведения. Его функциональность определяется компонентами (</w:t>
+      </w:r>
+      <w:proofErr w:type="spellStart"/>
+      <w:r>
+        <w:t>Components</w:t>
+      </w:r>
+      <w:proofErr w:type="spellEnd"/>
+      <w:r>
+        <w:t>), которые прикрепляются к нему. Компоненты – это модульные фрагменты кода, реализующие определенные аспекты объекта.</w:t>
+      </w:r>
+    </w:p>
+    <w:p>
+      <w:r>
+        <w:tab/>
+        <w:t xml:space="preserve">Например, </w:t>
+      </w:r>
+      <w:proofErr w:type="spellStart"/>
+      <w:r>
         <w:t>Transform</w:t>
       </w:r>
       <w:proofErr w:type="spellEnd"/>
-    </w:p>
-    <w:p>
-      <w:pPr>
-        <w:ind w:firstLine="708"/>
-      </w:pPr>
-      <w:r>
-        <w:t>М</w:t>
-      </w:r>
-      <w:r>
-        <w:t>одульная архитектура</w:t>
-      </w:r>
-      <w:r>
-        <w:t xml:space="preserve"> </w:t>
+      <w:r>
+        <w:t xml:space="preserve">: Обязательный компонент для каждого </w:t>
       </w:r>
       <w:proofErr w:type="spellStart"/>
       <w:r>
@@ -6487,111 +6124,43 @@
       </w:r>
       <w:proofErr w:type="spellEnd"/>
       <w:r>
-        <w:t xml:space="preserve">, основанная на компонентах, позволяет создавать разнообразные объекты с различным поведением и функциональностью. Умение эффективно использовать </w:t>
+        <w:t>, определяющий его положение (</w:t>
       </w:r>
       <w:proofErr w:type="spellStart"/>
       <w:r>
-        <w:t>GameObject'ы</w:t>
+        <w:t>position</w:t>
       </w:r>
       <w:proofErr w:type="spellEnd"/>
       <w:r>
-        <w:t xml:space="preserve"> и их компоненты является ключевым навыком для разработчика игр и интерактивных приложений в Unity.</w:t>
-      </w:r>
-      <w:r>
-        <w:t xml:space="preserve"> Рассмотрим некоторые из компонентов.</w:t>
-      </w:r>
-    </w:p>
-    <w:p>
-      <w:pPr>
-        <w:pStyle w:val="3"/>
-      </w:pPr>
-      <w:bookmarkStart w:id="10" w:name="_Toc185945907"/>
-      <w:r>
-        <w:t>Физика</w:t>
-      </w:r>
-      <w:bookmarkEnd w:id="10"/>
-    </w:p>
-    <w:p>
-      <w:pPr>
-        <w:ind w:firstLine="708"/>
-      </w:pPr>
-      <w:r>
-        <w:t xml:space="preserve">Компонент Rigidbody2D предоставляет инструменты для создания реалистичной физики в 2D-играх Unity. Он позволяет моделировать движение </w:t>
-      </w:r>
-      <w:r>
-        <w:lastRenderedPageBreak/>
-        <w:t xml:space="preserve">объектов под действием сил, обрабатывать столкновения и создавать разнообразные игровые механики, основанные на физическом взаимодействии. </w:t>
-      </w:r>
-      <w:r>
-        <w:t xml:space="preserve">Rigidbody2D </w:t>
-      </w:r>
-      <w:r>
-        <w:t>предоставляет большое количество методов для работы с физикой, например, приложение силы, добавление крутящего момента и другие.</w:t>
-      </w:r>
-      <w:r>
-        <w:t xml:space="preserve"> </w:t>
-      </w:r>
-    </w:p>
-    <w:p>
-      <w:pPr>
-        <w:ind w:firstLine="708"/>
-      </w:pPr>
-      <w:r>
-        <w:t xml:space="preserve">Как было сказано ранее </w:t>
+        <w:t>), вращение (</w:t>
       </w:r>
       <w:proofErr w:type="spellStart"/>
       <w:r>
-        <w:t>Transform</w:t>
+        <w:t>rotation</w:t>
       </w:r>
       <w:proofErr w:type="spellEnd"/>
       <w:r>
-        <w:t xml:space="preserve"> служит основой для определения положения, вращения и масштаба </w:t>
+        <w:t>) и масштаб (</w:t>
       </w:r>
       <w:proofErr w:type="spellStart"/>
       <w:r>
-        <w:t>GameObject</w:t>
+        <w:t>scale</w:t>
       </w:r>
       <w:proofErr w:type="spellEnd"/>
       <w:r>
-        <w:t xml:space="preserve">, однако его поведение изменяется при добавлении компонента Rigidbody2D. Rigidbody2D берет на себя управление положением объекта в соответствии с законами физики, переопределяя </w:t>
-      </w:r>
-      <w:proofErr w:type="spellStart"/>
-      <w:r>
-        <w:t>Transform</w:t>
-      </w:r>
-      <w:proofErr w:type="spellEnd"/>
-      <w:r>
-        <w:t xml:space="preserve"> для синхронизации визуального отображения с физической симуляцией. Прямое изменение </w:t>
-      </w:r>
-      <w:proofErr w:type="spellStart"/>
-      <w:r>
-        <w:t>Transform</w:t>
-      </w:r>
-      <w:proofErr w:type="spellEnd"/>
-      <w:r>
-        <w:t xml:space="preserve"> объекта с Rigidbody2D приводит к непредсказуемому поведению и ошибкам, поэтому управление положением должно осуществляться исключительно через сам Rigidbody2D.</w:t>
-      </w:r>
-    </w:p>
-    <w:p>
-      <w:pPr>
-        <w:ind w:firstLine="708"/>
-      </w:pPr>
-    </w:p>
-    <w:p>
-      <w:pPr>
-        <w:keepNext/>
-        <w:ind w:firstLine="708"/>
-        <w:jc w:val="center"/>
-      </w:pPr>
+        <w:t>) в пространстве сцены.</w:t>
+      </w:r>
+    </w:p>
+    <w:p>
       <w:r>
         <w:rPr>
           <w:noProof/>
         </w:rPr>
         <w:drawing>
-          <wp:inline distT="0" distB="0" distL="0" distR="0" wp14:anchorId="505FD1CF" wp14:editId="021B1B87">
-            <wp:extent cx="2743200" cy="2836976"/>
-            <wp:effectExtent l="0" t="0" r="0" b="1905"/>
-            <wp:docPr id="7" name="Рисунок 7"/>
+          <wp:inline distT="0" distB="0" distL="0" distR="0" wp14:anchorId="6A7A02E4" wp14:editId="65CDCCE7">
+            <wp:extent cx="5940425" cy="875030"/>
+            <wp:effectExtent l="0" t="0" r="3175" b="1270"/>
+            <wp:docPr id="5" name="Рисунок 5"/>
             <wp:cNvGraphicFramePr>
               <a:graphicFrameLocks xmlns:a="http://schemas.openxmlformats.org/drawingml/2006/main" noChangeAspect="1"/>
             </wp:cNvGraphicFramePr>
@@ -6611,7 +6180,7 @@
                   <pic:spPr>
                     <a:xfrm>
                       <a:off x="0" y="0"/>
-                      <a:ext cx="2801585" cy="2897357"/>
+                      <a:ext cx="5940425" cy="875030"/>
                     </a:xfrm>
                     <a:prstGeom prst="rect">
                       <a:avLst/>
@@ -6638,286 +6207,137 @@
           <w:i w:val="0"/>
           <w:iCs w:val="0"/>
         </w:rPr>
-        <w:t>Рисунок 5. Компонент</w:t>
+        <w:t>Рисунок 4</w:t>
       </w:r>
       <w:r>
         <w:rPr>
           <w:i w:val="0"/>
           <w:iCs w:val="0"/>
-          <w:noProof/>
-        </w:rPr>
-        <w:t xml:space="preserve"> </w:t>
+        </w:rPr>
+        <w:t>.</w:t>
       </w:r>
       <w:r>
         <w:rPr>
           <w:i w:val="0"/>
           <w:iCs w:val="0"/>
-          <w:noProof/>
-          <w:lang w:val="en-US"/>
-        </w:rPr>
-        <w:t>Rigidbody</w:t>
-      </w:r>
+        </w:rPr>
+        <w:t xml:space="preserve"> Компонент </w:t>
+      </w:r>
+      <w:proofErr w:type="spellStart"/>
       <w:r>
         <w:rPr>
           <w:i w:val="0"/>
           <w:iCs w:val="0"/>
-          <w:noProof/>
-        </w:rPr>
-        <w:t>2</w:t>
-      </w:r>
-      <w:r>
-        <w:rPr>
-          <w:i w:val="0"/>
-          <w:iCs w:val="0"/>
-          <w:noProof/>
-          <w:lang w:val="en-US"/>
-        </w:rPr>
-        <w:t>D</w:t>
-      </w:r>
+        </w:rPr>
+        <w:t>Transform</w:t>
+      </w:r>
+      <w:proofErr w:type="spellEnd"/>
     </w:p>
     <w:p>
       <w:pPr>
         <w:ind w:firstLine="708"/>
       </w:pPr>
       <w:r>
-        <w:t>Сдела</w:t>
-      </w:r>
-      <w:r>
-        <w:t>ть</w:t>
+        <w:t>М</w:t>
+      </w:r>
+      <w:r>
+        <w:t>одульная архитектура</w:t>
       </w:r>
       <w:r>
         <w:t xml:space="preserve"> </w:t>
       </w:r>
       <w:proofErr w:type="spellStart"/>
       <w:r>
-        <w:rPr>
-          <w:lang w:val="en-US"/>
-        </w:rPr>
         <w:t>GameObject</w:t>
       </w:r>
       <w:proofErr w:type="spellEnd"/>
       <w:r>
+        <w:t xml:space="preserve">, основанная на компонентах, позволяет создавать разнообразные объекты с различным поведением и функциональностью. Умение эффективно использовать </w:t>
+      </w:r>
+      <w:proofErr w:type="spellStart"/>
+      <w:r>
+        <w:t>GameObject'ы</w:t>
+      </w:r>
+      <w:proofErr w:type="spellEnd"/>
+      <w:r>
+        <w:t xml:space="preserve"> и их компоненты является ключевым навыком для разработчика игр и интерактивных приложений в Unity.</w:t>
+      </w:r>
+      <w:r>
+        <w:t xml:space="preserve"> Рассмотрим некоторые из компонентов.</w:t>
+      </w:r>
+    </w:p>
+    <w:p>
+      <w:pPr>
+        <w:pStyle w:val="3"/>
+      </w:pPr>
+      <w:bookmarkStart w:id="10" w:name="_Toc185945907"/>
+      <w:r>
+        <w:t>Физика</w:t>
+      </w:r>
+      <w:bookmarkEnd w:id="10"/>
+    </w:p>
+    <w:p>
+      <w:pPr>
+        <w:ind w:firstLine="708"/>
+      </w:pPr>
+      <w:r>
+        <w:t xml:space="preserve">Компонент Rigidbody2D предоставляет инструменты для создания реалистичной физики в 2D-играх Unity. Он позволяет моделировать движение </w:t>
+      </w:r>
+      <w:r>
+        <w:lastRenderedPageBreak/>
+        <w:t xml:space="preserve">объектов под действием сил, обрабатывать столкновения и создавать разнообразные игровые механики, основанные на физическом взаимодействии. Rigidbody2D </w:t>
+      </w:r>
+      <w:r>
+        <w:t>предоставляет большое количество методов для работы с физикой, например, приложение силы, добавление крутящего момента и другие.</w:t>
+      </w:r>
+      <w:r>
         <w:t xml:space="preserve"> </w:t>
       </w:r>
-      <w:r>
-        <w:t xml:space="preserve">твердым телом с помощью </w:t>
+    </w:p>
+    <w:p>
+      <w:pPr>
+        <w:ind w:firstLine="708"/>
+      </w:pPr>
+      <w:r>
+        <w:t xml:space="preserve">Как было сказано ранее </w:t>
       </w:r>
       <w:proofErr w:type="spellStart"/>
       <w:r>
-        <w:rPr>
-          <w:lang w:val="en-US"/>
-        </w:rPr>
-        <w:t>Rigidbody</w:t>
+        <w:t>Transform</w:t>
       </w:r>
       <w:proofErr w:type="spellEnd"/>
       <w:r>
-        <w:t>2</w:t>
-      </w:r>
-      <w:r>
-        <w:rPr>
-          <w:lang w:val="en-US"/>
-        </w:rPr>
-        <w:t>D</w:t>
-      </w:r>
-      <w:r>
-        <w:t xml:space="preserve"> </w:t>
-      </w:r>
-      <w:r>
-        <w:t xml:space="preserve">недостаточно для того, чтобы он мог сталкиваться с окружением. Для этого необходимо добавить коллайдер. </w:t>
+        <w:t xml:space="preserve"> служит основой для определения положения, вращения и масштаба </w:t>
+      </w:r>
+      <w:proofErr w:type="spellStart"/>
+      <w:r>
+        <w:t>GameObject</w:t>
+      </w:r>
+      <w:proofErr w:type="spellEnd"/>
+      <w:r>
+        <w:t xml:space="preserve">, однако его поведение изменяется при добавлении компонента Rigidbody2D. Rigidbody2D берет на себя управление положением объекта в соответствии с законами физики, переопределяя </w:t>
+      </w:r>
+      <w:proofErr w:type="spellStart"/>
+      <w:r>
+        <w:t>Transform</w:t>
+      </w:r>
+      <w:proofErr w:type="spellEnd"/>
+      <w:r>
+        <w:t xml:space="preserve"> для синхронизации визуального отображения с физической симуляцией. Прямое изменение </w:t>
+      </w:r>
+      <w:proofErr w:type="spellStart"/>
+      <w:r>
+        <w:t>Transform</w:t>
+      </w:r>
+      <w:proofErr w:type="spellEnd"/>
+      <w:r>
+        <w:t xml:space="preserve"> объекта с Rigidbody2D приводит к непредсказуемому поведению и ошибкам, поэтому управление положением должно осуществляться исключительно через сам Rigidbody2D.</w:t>
       </w:r>
     </w:p>
     <w:p>
       <w:pPr>
         <w:ind w:firstLine="708"/>
       </w:pPr>
-      <w:proofErr w:type="spellStart"/>
-      <w:r>
-        <w:t>Collider</w:t>
-      </w:r>
-      <w:proofErr w:type="spellEnd"/>
-      <w:r>
-        <w:t xml:space="preserve"> — это компонент в Unity, который добавляет возможность коллизий с другими объектами для </w:t>
-      </w:r>
-      <w:proofErr w:type="spellStart"/>
-      <w:r>
-        <w:t>GameObject</w:t>
-      </w:r>
-      <w:proofErr w:type="spellEnd"/>
-      <w:r>
-        <w:t>.</w:t>
-      </w:r>
-      <w:r>
-        <w:t xml:space="preserve"> Данный компонент может принимать на объекте различную форму: </w:t>
-      </w:r>
-      <w:r>
-        <w:t xml:space="preserve">Box </w:t>
-      </w:r>
-      <w:proofErr w:type="spellStart"/>
-      <w:r>
-        <w:t>Collider</w:t>
-      </w:r>
-      <w:proofErr w:type="spellEnd"/>
-      <w:r>
-        <w:t xml:space="preserve"> 2D</w:t>
-      </w:r>
-      <w:r>
-        <w:t xml:space="preserve">, </w:t>
-      </w:r>
-      <w:proofErr w:type="spellStart"/>
-      <w:r>
-        <w:t>Circle</w:t>
-      </w:r>
-      <w:proofErr w:type="spellEnd"/>
-      <w:r>
-        <w:t xml:space="preserve"> </w:t>
-      </w:r>
-      <w:proofErr w:type="spellStart"/>
-      <w:r>
-        <w:t>Collider</w:t>
-      </w:r>
-      <w:proofErr w:type="spellEnd"/>
-      <w:r>
-        <w:t xml:space="preserve"> 2D</w:t>
-      </w:r>
-      <w:r>
-        <w:t xml:space="preserve">, </w:t>
-      </w:r>
-      <w:proofErr w:type="spellStart"/>
-      <w:r>
-        <w:lastRenderedPageBreak/>
-        <w:t>Polygon</w:t>
-      </w:r>
-      <w:proofErr w:type="spellEnd"/>
-      <w:r>
-        <w:t xml:space="preserve"> </w:t>
-      </w:r>
-      <w:proofErr w:type="spellStart"/>
-      <w:r>
-        <w:t>Collider</w:t>
-      </w:r>
-      <w:proofErr w:type="spellEnd"/>
-      <w:r>
-        <w:t xml:space="preserve"> 2D</w:t>
-      </w:r>
-      <w:r>
-        <w:t xml:space="preserve">, </w:t>
-      </w:r>
-      <w:r>
-        <w:t xml:space="preserve">Edge </w:t>
-      </w:r>
-      <w:proofErr w:type="spellStart"/>
-      <w:r>
-        <w:t>Collider</w:t>
-      </w:r>
-      <w:proofErr w:type="spellEnd"/>
-      <w:r>
-        <w:t xml:space="preserve"> 2D</w:t>
-      </w:r>
-      <w:r>
-        <w:t xml:space="preserve">, </w:t>
-      </w:r>
-      <w:proofErr w:type="spellStart"/>
-      <w:r>
-        <w:t>Capsule</w:t>
-      </w:r>
-      <w:proofErr w:type="spellEnd"/>
-      <w:r>
-        <w:t xml:space="preserve"> </w:t>
-      </w:r>
-      <w:proofErr w:type="spellStart"/>
-      <w:r>
-        <w:t>Collider</w:t>
-      </w:r>
-      <w:proofErr w:type="spellEnd"/>
-      <w:r>
-        <w:t xml:space="preserve"> 2D</w:t>
-      </w:r>
-      <w:r>
-        <w:t xml:space="preserve">. </w:t>
-      </w:r>
-      <w:r>
-        <w:t xml:space="preserve">При выборе коллайдера следует учитывать форму объекта, требования к точности столкновений и производительность. Для простых объектов лучше использовать Box </w:t>
-      </w:r>
-      <w:proofErr w:type="spellStart"/>
-      <w:r>
-        <w:t>Collider</w:t>
-      </w:r>
-      <w:proofErr w:type="spellEnd"/>
-      <w:r>
-        <w:t xml:space="preserve"> 2D или </w:t>
-      </w:r>
-      <w:proofErr w:type="spellStart"/>
-      <w:r>
-        <w:t>Circle</w:t>
-      </w:r>
-      <w:proofErr w:type="spellEnd"/>
-      <w:r>
-        <w:t xml:space="preserve"> </w:t>
-      </w:r>
-      <w:proofErr w:type="spellStart"/>
-      <w:r>
-        <w:t>Collider</w:t>
-      </w:r>
-      <w:proofErr w:type="spellEnd"/>
-      <w:r>
-        <w:t xml:space="preserve"> 2D. Для объектов сложной формы можно использовать </w:t>
-      </w:r>
-      <w:proofErr w:type="spellStart"/>
-      <w:r>
-        <w:t>Polygon</w:t>
-      </w:r>
-      <w:proofErr w:type="spellEnd"/>
-      <w:r>
-        <w:t xml:space="preserve"> </w:t>
-      </w:r>
-      <w:proofErr w:type="spellStart"/>
-      <w:r>
-        <w:t>Collider</w:t>
-      </w:r>
-      <w:proofErr w:type="spellEnd"/>
-      <w:r>
-        <w:t xml:space="preserve"> 2D или </w:t>
-      </w:r>
-      <w:proofErr w:type="spellStart"/>
-      <w:r>
-        <w:t>Composite</w:t>
-      </w:r>
-      <w:proofErr w:type="spellEnd"/>
-      <w:r>
-        <w:t xml:space="preserve"> </w:t>
-      </w:r>
-      <w:proofErr w:type="spellStart"/>
-      <w:r>
-        <w:t>Collider</w:t>
-      </w:r>
-      <w:proofErr w:type="spellEnd"/>
-      <w:r>
-        <w:t xml:space="preserve"> 2D. Edge </w:t>
-      </w:r>
-      <w:proofErr w:type="spellStart"/>
-      <w:r>
-        <w:t>Collider</w:t>
-      </w:r>
-      <w:proofErr w:type="spellEnd"/>
-      <w:r>
-        <w:t xml:space="preserve"> 2D подходит для представления тонких объектов. </w:t>
-      </w:r>
-      <w:proofErr w:type="spellStart"/>
-      <w:r>
-        <w:t>Capsule</w:t>
-      </w:r>
-      <w:proofErr w:type="spellEnd"/>
-      <w:r>
-        <w:t xml:space="preserve"> </w:t>
-      </w:r>
-      <w:proofErr w:type="spellStart"/>
-      <w:r>
-        <w:t>Collider</w:t>
-      </w:r>
-      <w:proofErr w:type="spellEnd"/>
-      <w:r>
-        <w:t xml:space="preserve"> 2D хорошо подходит для персонажей.</w:t>
-      </w:r>
     </w:p>
     <w:p>
       <w:pPr>
@@ -6930,10 +6350,10 @@
           <w:noProof/>
         </w:rPr>
         <w:drawing>
-          <wp:inline distT="0" distB="0" distL="0" distR="0" wp14:anchorId="5DC56C6E" wp14:editId="3DD9C83F">
-            <wp:extent cx="4008729" cy="1611509"/>
-            <wp:effectExtent l="0" t="0" r="0" b="8255"/>
-            <wp:docPr id="8" name="Рисунок 8"/>
+          <wp:inline distT="0" distB="0" distL="0" distR="0" wp14:anchorId="233A9F39" wp14:editId="1AFB175D">
+            <wp:extent cx="2743200" cy="2836976"/>
+            <wp:effectExtent l="0" t="0" r="0" b="1905"/>
+            <wp:docPr id="7" name="Рисунок 7"/>
             <wp:cNvGraphicFramePr>
               <a:graphicFrameLocks xmlns:a="http://schemas.openxmlformats.org/drawingml/2006/main" noChangeAspect="1"/>
             </wp:cNvGraphicFramePr>
@@ -6953,6 +6373,342 @@
                   <pic:spPr>
                     <a:xfrm>
                       <a:off x="0" y="0"/>
+                      <a:ext cx="2801585" cy="2897357"/>
+                    </a:xfrm>
+                    <a:prstGeom prst="rect">
+                      <a:avLst/>
+                    </a:prstGeom>
+                  </pic:spPr>
+                </pic:pic>
+              </a:graphicData>
+            </a:graphic>
+          </wp:inline>
+        </w:drawing>
+      </w:r>
+    </w:p>
+    <w:p>
+      <w:pPr>
+        <w:pStyle w:val="ab"/>
+        <w:jc w:val="center"/>
+        <w:rPr>
+          <w:i w:val="0"/>
+          <w:iCs w:val="0"/>
+        </w:rPr>
+      </w:pPr>
+      <w:r>
+        <w:rPr>
+          <w:i w:val="0"/>
+          <w:iCs w:val="0"/>
+        </w:rPr>
+        <w:t>Рисунок 5. Компонент</w:t>
+      </w:r>
+      <w:r>
+        <w:rPr>
+          <w:i w:val="0"/>
+          <w:iCs w:val="0"/>
+          <w:noProof/>
+        </w:rPr>
+        <w:t xml:space="preserve"> </w:t>
+      </w:r>
+      <w:r>
+        <w:rPr>
+          <w:i w:val="0"/>
+          <w:iCs w:val="0"/>
+          <w:noProof/>
+          <w:lang w:val="en-US"/>
+        </w:rPr>
+        <w:t>Rigidbody</w:t>
+      </w:r>
+      <w:r>
+        <w:rPr>
+          <w:i w:val="0"/>
+          <w:iCs w:val="0"/>
+          <w:noProof/>
+        </w:rPr>
+        <w:t>2</w:t>
+      </w:r>
+      <w:r>
+        <w:rPr>
+          <w:i w:val="0"/>
+          <w:iCs w:val="0"/>
+          <w:noProof/>
+          <w:lang w:val="en-US"/>
+        </w:rPr>
+        <w:t>D</w:t>
+      </w:r>
+    </w:p>
+    <w:p>
+      <w:pPr>
+        <w:ind w:firstLine="708"/>
+      </w:pPr>
+      <w:r>
+        <w:t xml:space="preserve">Сделать </w:t>
+      </w:r>
+      <w:proofErr w:type="spellStart"/>
+      <w:r>
+        <w:rPr>
+          <w:lang w:val="en-US"/>
+        </w:rPr>
+        <w:t>GameObject</w:t>
+      </w:r>
+      <w:proofErr w:type="spellEnd"/>
+      <w:r>
+        <w:t xml:space="preserve"> </w:t>
+      </w:r>
+      <w:r>
+        <w:t xml:space="preserve">твердым телом с помощью </w:t>
+      </w:r>
+      <w:proofErr w:type="spellStart"/>
+      <w:r>
+        <w:rPr>
+          <w:lang w:val="en-US"/>
+        </w:rPr>
+        <w:t>Rigidbody</w:t>
+      </w:r>
+      <w:proofErr w:type="spellEnd"/>
+      <w:r>
+        <w:t>2</w:t>
+      </w:r>
+      <w:r>
+        <w:rPr>
+          <w:lang w:val="en-US"/>
+        </w:rPr>
+        <w:t>D</w:t>
+      </w:r>
+      <w:r>
+        <w:t xml:space="preserve"> </w:t>
+      </w:r>
+      <w:r>
+        <w:t xml:space="preserve">недостаточно для того, чтобы он мог сталкиваться с окружением. Для этого необходимо добавить коллайдер. </w:t>
+      </w:r>
+    </w:p>
+    <w:p>
+      <w:pPr>
+        <w:ind w:firstLine="708"/>
+      </w:pPr>
+      <w:proofErr w:type="spellStart"/>
+      <w:r>
+        <w:t>Collider</w:t>
+      </w:r>
+      <w:proofErr w:type="spellEnd"/>
+      <w:r>
+        <w:t xml:space="preserve"> — это компонент в Unity, который добавляет возможность коллизий с другими объектами для </w:t>
+      </w:r>
+      <w:proofErr w:type="spellStart"/>
+      <w:r>
+        <w:t>GameObject</w:t>
+      </w:r>
+      <w:proofErr w:type="spellEnd"/>
+      <w:r>
+        <w:t>.</w:t>
+      </w:r>
+      <w:r>
+        <w:t xml:space="preserve"> Данный компонент может принимать на объекте различную форму: </w:t>
+      </w:r>
+      <w:r>
+        <w:t xml:space="preserve">Box </w:t>
+      </w:r>
+      <w:proofErr w:type="spellStart"/>
+      <w:r>
+        <w:t>Collider</w:t>
+      </w:r>
+      <w:proofErr w:type="spellEnd"/>
+      <w:r>
+        <w:t xml:space="preserve"> 2D</w:t>
+      </w:r>
+      <w:r>
+        <w:t xml:space="preserve">, </w:t>
+      </w:r>
+      <w:proofErr w:type="spellStart"/>
+      <w:r>
+        <w:t>Circle</w:t>
+      </w:r>
+      <w:proofErr w:type="spellEnd"/>
+      <w:r>
+        <w:t xml:space="preserve"> </w:t>
+      </w:r>
+      <w:proofErr w:type="spellStart"/>
+      <w:r>
+        <w:t>Collider</w:t>
+      </w:r>
+      <w:proofErr w:type="spellEnd"/>
+      <w:r>
+        <w:t xml:space="preserve"> 2D</w:t>
+      </w:r>
+      <w:r>
+        <w:t xml:space="preserve">, </w:t>
+      </w:r>
+      <w:proofErr w:type="spellStart"/>
+      <w:r>
+        <w:lastRenderedPageBreak/>
+        <w:t>Polygon</w:t>
+      </w:r>
+      <w:proofErr w:type="spellEnd"/>
+      <w:r>
+        <w:t xml:space="preserve"> </w:t>
+      </w:r>
+      <w:proofErr w:type="spellStart"/>
+      <w:r>
+        <w:t>Collider</w:t>
+      </w:r>
+      <w:proofErr w:type="spellEnd"/>
+      <w:r>
+        <w:t xml:space="preserve"> 2D</w:t>
+      </w:r>
+      <w:r>
+        <w:t xml:space="preserve">, </w:t>
+      </w:r>
+      <w:r>
+        <w:t xml:space="preserve">Edge </w:t>
+      </w:r>
+      <w:proofErr w:type="spellStart"/>
+      <w:r>
+        <w:t>Collider</w:t>
+      </w:r>
+      <w:proofErr w:type="spellEnd"/>
+      <w:r>
+        <w:t xml:space="preserve"> 2D</w:t>
+      </w:r>
+      <w:r>
+        <w:t xml:space="preserve">, </w:t>
+      </w:r>
+      <w:proofErr w:type="spellStart"/>
+      <w:r>
+        <w:t>Capsule</w:t>
+      </w:r>
+      <w:proofErr w:type="spellEnd"/>
+      <w:r>
+        <w:t xml:space="preserve"> </w:t>
+      </w:r>
+      <w:proofErr w:type="spellStart"/>
+      <w:r>
+        <w:t>Collider</w:t>
+      </w:r>
+      <w:proofErr w:type="spellEnd"/>
+      <w:r>
+        <w:t xml:space="preserve"> 2D</w:t>
+      </w:r>
+      <w:r>
+        <w:t xml:space="preserve">. </w:t>
+      </w:r>
+      <w:r>
+        <w:t xml:space="preserve">При выборе коллайдера следует учитывать форму объекта, требования к точности столкновений и производительность. Для простых объектов лучше использовать Box </w:t>
+      </w:r>
+      <w:proofErr w:type="spellStart"/>
+      <w:r>
+        <w:t>Collider</w:t>
+      </w:r>
+      <w:proofErr w:type="spellEnd"/>
+      <w:r>
+        <w:t xml:space="preserve"> 2D или </w:t>
+      </w:r>
+      <w:proofErr w:type="spellStart"/>
+      <w:r>
+        <w:t>Circle</w:t>
+      </w:r>
+      <w:proofErr w:type="spellEnd"/>
+      <w:r>
+        <w:t xml:space="preserve"> </w:t>
+      </w:r>
+      <w:proofErr w:type="spellStart"/>
+      <w:r>
+        <w:t>Collider</w:t>
+      </w:r>
+      <w:proofErr w:type="spellEnd"/>
+      <w:r>
+        <w:t xml:space="preserve"> 2D. Для объектов сложной формы можно использовать </w:t>
+      </w:r>
+      <w:proofErr w:type="spellStart"/>
+      <w:r>
+        <w:t>Polygon</w:t>
+      </w:r>
+      <w:proofErr w:type="spellEnd"/>
+      <w:r>
+        <w:t xml:space="preserve"> </w:t>
+      </w:r>
+      <w:proofErr w:type="spellStart"/>
+      <w:r>
+        <w:t>Collider</w:t>
+      </w:r>
+      <w:proofErr w:type="spellEnd"/>
+      <w:r>
+        <w:t xml:space="preserve"> 2D или </w:t>
+      </w:r>
+      <w:proofErr w:type="spellStart"/>
+      <w:r>
+        <w:t>Composite</w:t>
+      </w:r>
+      <w:proofErr w:type="spellEnd"/>
+      <w:r>
+        <w:t xml:space="preserve"> </w:t>
+      </w:r>
+      <w:proofErr w:type="spellStart"/>
+      <w:r>
+        <w:t>Collider</w:t>
+      </w:r>
+      <w:proofErr w:type="spellEnd"/>
+      <w:r>
+        <w:t xml:space="preserve"> 2D. Edge </w:t>
+      </w:r>
+      <w:proofErr w:type="spellStart"/>
+      <w:r>
+        <w:t>Collider</w:t>
+      </w:r>
+      <w:proofErr w:type="spellEnd"/>
+      <w:r>
+        <w:t xml:space="preserve"> 2D подходит для представления тонких объектов. </w:t>
+      </w:r>
+      <w:proofErr w:type="spellStart"/>
+      <w:r>
+        <w:t>Capsule</w:t>
+      </w:r>
+      <w:proofErr w:type="spellEnd"/>
+      <w:r>
+        <w:t xml:space="preserve"> </w:t>
+      </w:r>
+      <w:proofErr w:type="spellStart"/>
+      <w:r>
+        <w:t>Collider</w:t>
+      </w:r>
+      <w:proofErr w:type="spellEnd"/>
+      <w:r>
+        <w:t xml:space="preserve"> 2D хорошо подходит для персонажей.</w:t>
+      </w:r>
+    </w:p>
+    <w:p>
+      <w:pPr>
+        <w:keepNext/>
+        <w:ind w:firstLine="708"/>
+        <w:jc w:val="center"/>
+      </w:pPr>
+      <w:r>
+        <w:rPr>
+          <w:noProof/>
+        </w:rPr>
+        <w:drawing>
+          <wp:inline distT="0" distB="0" distL="0" distR="0" wp14:anchorId="2DBC1378" wp14:editId="23439D6A">
+            <wp:extent cx="4008729" cy="1611509"/>
+            <wp:effectExtent l="0" t="0" r="0" b="8255"/>
+            <wp:docPr id="8" name="Рисунок 8"/>
+            <wp:cNvGraphicFramePr>
+              <a:graphicFrameLocks xmlns:a="http://schemas.openxmlformats.org/drawingml/2006/main" noChangeAspect="1"/>
+            </wp:cNvGraphicFramePr>
+            <a:graphic xmlns:a="http://schemas.openxmlformats.org/drawingml/2006/main">
+              <a:graphicData uri="http://schemas.openxmlformats.org/drawingml/2006/picture">
+                <pic:pic xmlns:pic="http://schemas.openxmlformats.org/drawingml/2006/picture">
+                  <pic:nvPicPr>
+                    <pic:cNvPr id="1" name=""/>
+                    <pic:cNvPicPr/>
+                  </pic:nvPicPr>
+                  <pic:blipFill>
+                    <a:blip r:embed="rId14"/>
+                    <a:stretch>
+                      <a:fillRect/>
+                    </a:stretch>
+                  </pic:blipFill>
+                  <pic:spPr>
+                    <a:xfrm>
+                      <a:off x="0" y="0"/>
                       <a:ext cx="4030350" cy="1620201"/>
                     </a:xfrm>
                     <a:prstGeom prst="rect">
@@ -7061,10 +6817,7 @@
         <w:t>D</w:t>
       </w:r>
       <w:r>
-        <w:t xml:space="preserve"> платформера. Текстуры,</w:t>
-      </w:r>
-      <w:r>
-        <w:t xml:space="preserve"> накладываемые на </w:t>
+        <w:t xml:space="preserve"> платформера. Текстуры, накладываемые на </w:t>
       </w:r>
       <w:r>
         <w:t>2</w:t>
@@ -7089,13 +6842,7 @@
         <w:t>спрайтами</w:t>
       </w:r>
       <w:r>
-        <w:t>. Начиная с простых фигур</w:t>
-      </w:r>
-      <w:r>
-        <w:t xml:space="preserve"> </w:t>
-      </w:r>
-      <w:r>
-        <w:t>(круг, квадрат), заканчивая детализированными персонажами и объектами окружения.</w:t>
+        <w:t>. Начиная с простых фигур (круг, квадрат), заканчивая детализированными персонажами и объектами окружения.</w:t>
       </w:r>
     </w:p>
     <w:p>
@@ -7109,7 +6856,7 @@
         </w:rPr>
         <w:lastRenderedPageBreak/>
         <w:drawing>
-          <wp:inline distT="0" distB="0" distL="0" distR="0" wp14:anchorId="7BFE44DA" wp14:editId="7D82A221">
+          <wp:inline distT="0" distB="0" distL="0" distR="0" wp14:anchorId="73FAB589" wp14:editId="7413344A">
             <wp:extent cx="4040372" cy="1770498"/>
             <wp:effectExtent l="0" t="0" r="0" b="1270"/>
             <wp:docPr id="10" name="Рисунок 10"/>
@@ -7126,7 +6873,7 @@
                     </pic:cNvPicPr>
                   </pic:nvPicPr>
                   <pic:blipFill>
-                    <a:blip r:embed="rId14">
+                    <a:blip r:embed="rId15">
                       <a:extLst>
                         <a:ext uri="{28A0092B-C50C-407E-A947-70E740481C1C}">
                           <a14:useLocalDpi xmlns:a14="http://schemas.microsoft.com/office/drawing/2010/main" val="0"/>
@@ -7203,235 +6950,10 @@
           <w:noProof/>
         </w:rPr>
         <w:drawing>
-          <wp:inline distT="0" distB="0" distL="0" distR="0" wp14:anchorId="6FB517C0" wp14:editId="00CECC3B">
+          <wp:inline distT="0" distB="0" distL="0" distR="0" wp14:anchorId="1FC9EDE6" wp14:editId="20B86381">
             <wp:extent cx="3238500" cy="2327670"/>
             <wp:effectExtent l="0" t="0" r="0" b="0"/>
             <wp:docPr id="11" name="Рисунок 11"/>
-            <wp:cNvGraphicFramePr>
-              <a:graphicFrameLocks xmlns:a="http://schemas.openxmlformats.org/drawingml/2006/main" noChangeAspect="1"/>
-            </wp:cNvGraphicFramePr>
-            <a:graphic xmlns:a="http://schemas.openxmlformats.org/drawingml/2006/main">
-              <a:graphicData uri="http://schemas.openxmlformats.org/drawingml/2006/picture">
-                <pic:pic xmlns:pic="http://schemas.openxmlformats.org/drawingml/2006/picture">
-                  <pic:nvPicPr>
-                    <pic:cNvPr id="1" name=""/>
-                    <pic:cNvPicPr/>
-                  </pic:nvPicPr>
-                  <pic:blipFill>
-                    <a:blip r:embed="rId15"/>
-                    <a:stretch>
-                      <a:fillRect/>
-                    </a:stretch>
-                  </pic:blipFill>
-                  <pic:spPr>
-                    <a:xfrm>
-                      <a:off x="0" y="0"/>
-                      <a:ext cx="3261046" cy="2343875"/>
-                    </a:xfrm>
-                    <a:prstGeom prst="rect">
-                      <a:avLst/>
-                    </a:prstGeom>
-                  </pic:spPr>
-                </pic:pic>
-              </a:graphicData>
-            </a:graphic>
-          </wp:inline>
-        </w:drawing>
-      </w:r>
-    </w:p>
-    <w:p>
-      <w:pPr>
-        <w:pStyle w:val="ab"/>
-        <w:jc w:val="center"/>
-      </w:pPr>
-      <w:r>
-        <w:t xml:space="preserve">Рисунок </w:t>
-      </w:r>
-      <w:r>
-        <w:t xml:space="preserve">8. </w:t>
-      </w:r>
-      <w:r>
-        <w:rPr>
-          <w:lang w:val="en-US"/>
-        </w:rPr>
-        <w:t>Sprite</w:t>
-      </w:r>
-      <w:r>
-        <w:t xml:space="preserve"> </w:t>
-      </w:r>
-      <w:r>
-        <w:rPr>
-          <w:lang w:val="en-US"/>
-        </w:rPr>
-        <w:t>Renderer</w:t>
-      </w:r>
-    </w:p>
-    <w:p>
-      <w:pPr>
-        <w:ind w:firstLine="708"/>
-        <w:rPr>
-          <w:rFonts w:eastAsia="Times New Roman" w:cs="Times New Roman"/>
-          <w:kern w:val="36"/>
-          <w:szCs w:val="48"/>
-          <w:lang w:eastAsia="ru-RU"/>
-          <w14:ligatures w14:val="none"/>
-        </w:rPr>
-      </w:pPr>
-      <w:r>
-        <w:rPr>
-          <w:rFonts w:eastAsia="Times New Roman" w:cs="Times New Roman"/>
-          <w:kern w:val="36"/>
-          <w:szCs w:val="48"/>
-          <w:lang w:eastAsia="ru-RU"/>
-          <w14:ligatures w14:val="none"/>
-        </w:rPr>
-        <w:t>Д</w:t>
-      </w:r>
-      <w:r>
-        <w:rPr>
-          <w:rFonts w:eastAsia="Times New Roman" w:cs="Times New Roman"/>
-          <w:kern w:val="36"/>
-          <w:szCs w:val="48"/>
-          <w:lang w:eastAsia="ru-RU"/>
-          <w14:ligatures w14:val="none"/>
-        </w:rPr>
-        <w:t>ля нарезки изображения на отдельные спрайты</w:t>
-      </w:r>
-      <w:r>
-        <w:rPr>
-          <w:rFonts w:eastAsia="Times New Roman" w:cs="Times New Roman"/>
-          <w:kern w:val="36"/>
-          <w:szCs w:val="48"/>
-          <w:lang w:eastAsia="ru-RU"/>
-          <w14:ligatures w14:val="none"/>
-        </w:rPr>
-        <w:t xml:space="preserve"> используется инструмент </w:t>
-      </w:r>
-      <w:proofErr w:type="spellStart"/>
-      <w:r>
-        <w:rPr>
-          <w:rFonts w:eastAsia="Times New Roman" w:cs="Times New Roman"/>
-          <w:kern w:val="36"/>
-          <w:szCs w:val="48"/>
-          <w:lang w:eastAsia="ru-RU"/>
-          <w14:ligatures w14:val="none"/>
-        </w:rPr>
-        <w:t>Sp</w:t>
-      </w:r>
-      <w:proofErr w:type="spellEnd"/>
-      <w:r>
-        <w:rPr>
-          <w:rFonts w:eastAsia="Times New Roman" w:cs="Times New Roman"/>
-          <w:kern w:val="36"/>
-          <w:szCs w:val="48"/>
-          <w:lang w:val="en-US" w:eastAsia="ru-RU"/>
-          <w14:ligatures w14:val="none"/>
-        </w:rPr>
-        <w:t>r</w:t>
-      </w:r>
-      <w:proofErr w:type="spellStart"/>
-      <w:r>
-        <w:rPr>
-          <w:rFonts w:eastAsia="Times New Roman" w:cs="Times New Roman"/>
-          <w:kern w:val="36"/>
-          <w:szCs w:val="48"/>
-          <w:lang w:eastAsia="ru-RU"/>
-          <w14:ligatures w14:val="none"/>
-        </w:rPr>
-        <w:t>ite</w:t>
-      </w:r>
-      <w:proofErr w:type="spellEnd"/>
-      <w:r>
-        <w:rPr>
-          <w:rFonts w:eastAsia="Times New Roman" w:cs="Times New Roman"/>
-          <w:kern w:val="36"/>
-          <w:szCs w:val="48"/>
-          <w:lang w:eastAsia="ru-RU"/>
-          <w14:ligatures w14:val="none"/>
-        </w:rPr>
-        <w:t xml:space="preserve"> Editor. </w:t>
-      </w:r>
-      <w:r>
-        <w:rPr>
-          <w:rFonts w:eastAsia="Times New Roman" w:cs="Times New Roman"/>
-          <w:kern w:val="36"/>
-          <w:szCs w:val="48"/>
-          <w:lang w:eastAsia="ru-RU"/>
-          <w14:ligatures w14:val="none"/>
-        </w:rPr>
-        <w:t>Н</w:t>
-      </w:r>
-      <w:r>
-        <w:rPr>
-          <w:rFonts w:eastAsia="Times New Roman" w:cs="Times New Roman"/>
-          <w:kern w:val="36"/>
-          <w:szCs w:val="48"/>
-          <w:lang w:eastAsia="ru-RU"/>
-          <w14:ligatures w14:val="none"/>
-        </w:rPr>
-        <w:t>еобходимост</w:t>
-      </w:r>
-      <w:r>
-        <w:rPr>
-          <w:rFonts w:eastAsia="Times New Roman" w:cs="Times New Roman"/>
-          <w:kern w:val="36"/>
-          <w:szCs w:val="48"/>
-          <w:lang w:eastAsia="ru-RU"/>
-          <w14:ligatures w14:val="none"/>
-        </w:rPr>
-        <w:t>ь</w:t>
-      </w:r>
-      <w:r>
-        <w:rPr>
-          <w:rFonts w:eastAsia="Times New Roman" w:cs="Times New Roman"/>
-          <w:kern w:val="36"/>
-          <w:szCs w:val="48"/>
-          <w:lang w:eastAsia="ru-RU"/>
-          <w14:ligatures w14:val="none"/>
-        </w:rPr>
-        <w:t xml:space="preserve"> создавать отдельные файлы изображений для каждого спрайта</w:t>
-      </w:r>
-      <w:r>
-        <w:rPr>
-          <w:rFonts w:eastAsia="Times New Roman" w:cs="Times New Roman"/>
-          <w:kern w:val="36"/>
-          <w:szCs w:val="48"/>
-          <w:lang w:eastAsia="ru-RU"/>
-          <w14:ligatures w14:val="none"/>
-        </w:rPr>
-        <w:t xml:space="preserve"> отсутствует</w:t>
-      </w:r>
-      <w:r>
-        <w:rPr>
-          <w:rFonts w:eastAsia="Times New Roman" w:cs="Times New Roman"/>
-          <w:kern w:val="36"/>
-          <w:szCs w:val="48"/>
-          <w:lang w:eastAsia="ru-RU"/>
-          <w14:ligatures w14:val="none"/>
-        </w:rPr>
-        <w:t>, можно просто хранить всё в едином изображении, которое в дальнейшем можно просто нарезать.  Так часто поступают при создании 2D персонажей, где все его части и кадры анимации хранятся на едином изображении.</w:t>
-      </w:r>
-    </w:p>
-    <w:p>
-      <w:pPr>
-        <w:keepNext/>
-        <w:ind w:firstLine="708"/>
-        <w:jc w:val="center"/>
-      </w:pPr>
-      <w:r>
-        <w:rPr>
-          <w:rFonts w:eastAsia="Times New Roman" w:cs="Times New Roman"/>
-          <w:noProof/>
-          <w:kern w:val="36"/>
-          <w:szCs w:val="48"/>
-          <w:lang w:eastAsia="ru-RU"/>
-          <w14:ligatures w14:val="none"/>
-        </w:rPr>
-        <w:drawing>
-          <wp:inline distT="0" distB="0" distL="0" distR="0" wp14:anchorId="03F275AF" wp14:editId="7AC76FC5">
-            <wp:extent cx="4870410" cy="1676400"/>
-            <wp:effectExtent l="0" t="0" r="6985" b="0"/>
-            <wp:docPr id="13" name="Рисунок 13"/>
             <wp:cNvGraphicFramePr>
               <a:graphicFrameLocks xmlns:a="http://schemas.openxmlformats.org/drawingml/2006/main" noChangeAspect="1"/>
             </wp:cNvGraphicFramePr>
@@ -7451,6 +6973,231 @@
                   <pic:spPr>
                     <a:xfrm>
                       <a:off x="0" y="0"/>
+                      <a:ext cx="3261046" cy="2343875"/>
+                    </a:xfrm>
+                    <a:prstGeom prst="rect">
+                      <a:avLst/>
+                    </a:prstGeom>
+                  </pic:spPr>
+                </pic:pic>
+              </a:graphicData>
+            </a:graphic>
+          </wp:inline>
+        </w:drawing>
+      </w:r>
+    </w:p>
+    <w:p>
+      <w:pPr>
+        <w:pStyle w:val="ab"/>
+        <w:jc w:val="center"/>
+      </w:pPr>
+      <w:r>
+        <w:t xml:space="preserve">Рисунок </w:t>
+      </w:r>
+      <w:r>
+        <w:t xml:space="preserve">8. </w:t>
+      </w:r>
+      <w:r>
+        <w:rPr>
+          <w:lang w:val="en-US"/>
+        </w:rPr>
+        <w:t>Sprite</w:t>
+      </w:r>
+      <w:r>
+        <w:t xml:space="preserve"> </w:t>
+      </w:r>
+      <w:r>
+        <w:rPr>
+          <w:lang w:val="en-US"/>
+        </w:rPr>
+        <w:t>Renderer</w:t>
+      </w:r>
+    </w:p>
+    <w:p>
+      <w:pPr>
+        <w:ind w:firstLine="708"/>
+        <w:rPr>
+          <w:rFonts w:eastAsia="Times New Roman" w:cs="Times New Roman"/>
+          <w:kern w:val="36"/>
+          <w:szCs w:val="48"/>
+          <w:lang w:eastAsia="ru-RU"/>
+          <w14:ligatures w14:val="none"/>
+        </w:rPr>
+      </w:pPr>
+      <w:r>
+        <w:rPr>
+          <w:rFonts w:eastAsia="Times New Roman" w:cs="Times New Roman"/>
+          <w:kern w:val="36"/>
+          <w:szCs w:val="48"/>
+          <w:lang w:eastAsia="ru-RU"/>
+          <w14:ligatures w14:val="none"/>
+        </w:rPr>
+        <w:t>Д</w:t>
+      </w:r>
+      <w:r>
+        <w:rPr>
+          <w:rFonts w:eastAsia="Times New Roman" w:cs="Times New Roman"/>
+          <w:kern w:val="36"/>
+          <w:szCs w:val="48"/>
+          <w:lang w:eastAsia="ru-RU"/>
+          <w14:ligatures w14:val="none"/>
+        </w:rPr>
+        <w:t>ля нарезки изображения на отдельные спрайты</w:t>
+      </w:r>
+      <w:r>
+        <w:rPr>
+          <w:rFonts w:eastAsia="Times New Roman" w:cs="Times New Roman"/>
+          <w:kern w:val="36"/>
+          <w:szCs w:val="48"/>
+          <w:lang w:eastAsia="ru-RU"/>
+          <w14:ligatures w14:val="none"/>
+        </w:rPr>
+        <w:t xml:space="preserve"> используется инструмент </w:t>
+      </w:r>
+      <w:proofErr w:type="spellStart"/>
+      <w:r>
+        <w:rPr>
+          <w:rFonts w:eastAsia="Times New Roman" w:cs="Times New Roman"/>
+          <w:kern w:val="36"/>
+          <w:szCs w:val="48"/>
+          <w:lang w:eastAsia="ru-RU"/>
+          <w14:ligatures w14:val="none"/>
+        </w:rPr>
+        <w:t>Sp</w:t>
+      </w:r>
+      <w:proofErr w:type="spellEnd"/>
+      <w:r>
+        <w:rPr>
+          <w:rFonts w:eastAsia="Times New Roman" w:cs="Times New Roman"/>
+          <w:kern w:val="36"/>
+          <w:szCs w:val="48"/>
+          <w:lang w:val="en-US" w:eastAsia="ru-RU"/>
+          <w14:ligatures w14:val="none"/>
+        </w:rPr>
+        <w:t>r</w:t>
+      </w:r>
+      <w:proofErr w:type="spellStart"/>
+      <w:r>
+        <w:rPr>
+          <w:rFonts w:eastAsia="Times New Roman" w:cs="Times New Roman"/>
+          <w:kern w:val="36"/>
+          <w:szCs w:val="48"/>
+          <w:lang w:eastAsia="ru-RU"/>
+          <w14:ligatures w14:val="none"/>
+        </w:rPr>
+        <w:t>ite</w:t>
+      </w:r>
+      <w:proofErr w:type="spellEnd"/>
+      <w:r>
+        <w:rPr>
+          <w:rFonts w:eastAsia="Times New Roman" w:cs="Times New Roman"/>
+          <w:kern w:val="36"/>
+          <w:szCs w:val="48"/>
+          <w:lang w:eastAsia="ru-RU"/>
+          <w14:ligatures w14:val="none"/>
+        </w:rPr>
+        <w:t xml:space="preserve"> Editor. </w:t>
+      </w:r>
+      <w:r>
+        <w:rPr>
+          <w:rFonts w:eastAsia="Times New Roman" w:cs="Times New Roman"/>
+          <w:kern w:val="36"/>
+          <w:szCs w:val="48"/>
+          <w:lang w:eastAsia="ru-RU"/>
+          <w14:ligatures w14:val="none"/>
+        </w:rPr>
+        <w:t>Н</w:t>
+      </w:r>
+      <w:r>
+        <w:rPr>
+          <w:rFonts w:eastAsia="Times New Roman" w:cs="Times New Roman"/>
+          <w:kern w:val="36"/>
+          <w:szCs w:val="48"/>
+          <w:lang w:eastAsia="ru-RU"/>
+          <w14:ligatures w14:val="none"/>
+        </w:rPr>
+        <w:t>еобходимост</w:t>
+      </w:r>
+      <w:r>
+        <w:rPr>
+          <w:rFonts w:eastAsia="Times New Roman" w:cs="Times New Roman"/>
+          <w:kern w:val="36"/>
+          <w:szCs w:val="48"/>
+          <w:lang w:eastAsia="ru-RU"/>
+          <w14:ligatures w14:val="none"/>
+        </w:rPr>
+        <w:t>ь</w:t>
+      </w:r>
+      <w:r>
+        <w:rPr>
+          <w:rFonts w:eastAsia="Times New Roman" w:cs="Times New Roman"/>
+          <w:kern w:val="36"/>
+          <w:szCs w:val="48"/>
+          <w:lang w:eastAsia="ru-RU"/>
+          <w14:ligatures w14:val="none"/>
+        </w:rPr>
+        <w:t xml:space="preserve"> создавать отдельные файлы изображений для каждого спрайта</w:t>
+      </w:r>
+      <w:r>
+        <w:rPr>
+          <w:rFonts w:eastAsia="Times New Roman" w:cs="Times New Roman"/>
+          <w:kern w:val="36"/>
+          <w:szCs w:val="48"/>
+          <w:lang w:eastAsia="ru-RU"/>
+          <w14:ligatures w14:val="none"/>
+        </w:rPr>
+        <w:t xml:space="preserve"> отсутствует</w:t>
+      </w:r>
+      <w:r>
+        <w:rPr>
+          <w:rFonts w:eastAsia="Times New Roman" w:cs="Times New Roman"/>
+          <w:kern w:val="36"/>
+          <w:szCs w:val="48"/>
+          <w:lang w:eastAsia="ru-RU"/>
+          <w14:ligatures w14:val="none"/>
+        </w:rPr>
+        <w:t>, можно просто хранить всё в едином изображении, которое в дальнейшем можно просто нарезать.  Так часто поступают при создании 2D персонажей, где все его части и кадры анимации хранятся на едином изображении.</w:t>
+      </w:r>
+    </w:p>
+    <w:p>
+      <w:pPr>
+        <w:keepNext/>
+        <w:ind w:firstLine="708"/>
+        <w:jc w:val="center"/>
+      </w:pPr>
+      <w:r>
+        <w:rPr>
+          <w:rFonts w:eastAsia="Times New Roman" w:cs="Times New Roman"/>
+          <w:noProof/>
+          <w:kern w:val="36"/>
+          <w:szCs w:val="48"/>
+          <w:lang w:eastAsia="ru-RU"/>
+          <w14:ligatures w14:val="none"/>
+        </w:rPr>
+        <w:drawing>
+          <wp:inline distT="0" distB="0" distL="0" distR="0" wp14:anchorId="5CCE0243" wp14:editId="6639993B">
+            <wp:extent cx="4870410" cy="1676400"/>
+            <wp:effectExtent l="0" t="0" r="6985" b="0"/>
+            <wp:docPr id="13" name="Рисунок 13"/>
+            <wp:cNvGraphicFramePr>
+              <a:graphicFrameLocks xmlns:a="http://schemas.openxmlformats.org/drawingml/2006/main" noChangeAspect="1"/>
+            </wp:cNvGraphicFramePr>
+            <a:graphic xmlns:a="http://schemas.openxmlformats.org/drawingml/2006/main">
+              <a:graphicData uri="http://schemas.openxmlformats.org/drawingml/2006/picture">
+                <pic:pic xmlns:pic="http://schemas.openxmlformats.org/drawingml/2006/picture">
+                  <pic:nvPicPr>
+                    <pic:cNvPr id="1" name=""/>
+                    <pic:cNvPicPr/>
+                  </pic:nvPicPr>
+                  <pic:blipFill>
+                    <a:blip r:embed="rId17"/>
+                    <a:stretch>
+                      <a:fillRect/>
+                    </a:stretch>
+                  </pic:blipFill>
+                  <pic:spPr>
+                    <a:xfrm>
+                      <a:off x="0" y="0"/>
                       <a:ext cx="4909958" cy="1690012"/>
                     </a:xfrm>
                     <a:prstGeom prst="rect">
@@ -7489,13 +7236,7 @@
         <w:rPr>
           <w:lang w:val="en-US"/>
         </w:rPr>
-        <w:t>9. Sprite Edito</w:t>
-      </w:r>
-      <w:r>
-        <w:rPr>
-          <w:lang w:val="en-US"/>
-        </w:rPr>
-        <w:t>r</w:t>
+        <w:t>9. Sprite Editor</w:t>
       </w:r>
     </w:p>
     <w:p>
@@ -7584,7 +7325,7 @@
           <w14:ligatures w14:val="none"/>
         </w:rPr>
         <w:drawing>
-          <wp:inline distT="0" distB="0" distL="0" distR="0" wp14:anchorId="1E29B1EB" wp14:editId="409B3D04">
+          <wp:inline distT="0" distB="0" distL="0" distR="0" wp14:anchorId="4AB864EB" wp14:editId="1F046836">
             <wp:extent cx="5940425" cy="3277870"/>
             <wp:effectExtent l="0" t="0" r="3175" b="0"/>
             <wp:docPr id="1571577846" name="Рисунок 1"/>
@@ -7599,7 +7340,7 @@
                     <pic:cNvPicPr/>
                   </pic:nvPicPr>
                   <pic:blipFill>
-                    <a:blip r:embed="rId17">
+                    <a:blip r:embed="rId18">
                       <a:extLst>
                         <a:ext uri="{28A0092B-C50C-407E-A947-70E740481C1C}">
                           <a14:useLocalDpi xmlns:a14="http://schemas.microsoft.com/office/drawing/2010/main" val="0"/>
@@ -7661,7 +7402,77 @@
     <w:p>
       <w:r>
         <w:tab/>
-        <w:t>В процессе разработки игры потребовалось создать несколько пользовательских компонентов, чтобы реализовать необходимые функции и поведения игровых объектов. Создание пользовательских компонентов в Unity позволяет расширить функциональность стандартных компонентов и создать уникальные элементы игры.</w:t>
+        <w:t xml:space="preserve">В процессе разработки игры потребовалось создать несколько пользовательских компонентов, чтобы реализовать необходимые функции и поведения игровых объектов. </w:t>
+      </w:r>
+      <w:r>
+        <w:rPr>
+          <w:color w:val="FF0000"/>
+        </w:rPr>
+        <w:t xml:space="preserve">Объяснить, почему </w:t>
+      </w:r>
+      <w:r>
+        <w:rPr>
+          <w:color w:val="FF0000"/>
+          <w:lang w:val="en-US"/>
+        </w:rPr>
+        <w:t>RB</w:t>
+      </w:r>
+      <w:r>
+        <w:rPr>
+          <w:color w:val="FF0000"/>
+        </w:rPr>
+        <w:t>2 не используется</w:t>
+      </w:r>
+      <w:r>
+        <w:rPr>
+          <w:color w:val="FF0000"/>
+        </w:rPr>
+        <w:t xml:space="preserve">. Чаще всего используется </w:t>
+      </w:r>
+      <w:proofErr w:type="spellStart"/>
+      <w:r>
+        <w:rPr>
+          <w:color w:val="FF0000"/>
+          <w:lang w:val="en-US"/>
+        </w:rPr>
+        <w:t>rb</w:t>
+      </w:r>
+      <w:proofErr w:type="spellEnd"/>
+      <w:r>
+        <w:rPr>
+          <w:color w:val="FF0000"/>
+        </w:rPr>
+        <w:t xml:space="preserve">2 для мнимого упрощения разработки, так как ему не нужно описывать физическое движение самостоятельно, достаточно вызвать необходимый метод. Однако, это не значит, что использовать </w:t>
+      </w:r>
+      <w:proofErr w:type="spellStart"/>
+      <w:r>
+        <w:rPr>
+          <w:color w:val="FF0000"/>
+          <w:lang w:val="en-US"/>
+        </w:rPr>
+        <w:t>rb</w:t>
+      </w:r>
+      <w:proofErr w:type="spellEnd"/>
+      <w:r>
+        <w:rPr>
+          <w:color w:val="FF0000"/>
+        </w:rPr>
+        <w:t xml:space="preserve">2 не   </w:t>
+      </w:r>
+      <w:r>
+        <w:rPr>
+          <w:color w:val="FF0000"/>
+        </w:rPr>
+        <w:t>нужно вовсе. Напротив, … (физика коробки бочки, ну ты поняла - разберешься)</w:t>
+      </w:r>
+    </w:p>
+    <w:p/>
+    <w:p>
+      <w:pPr>
+        <w:ind w:firstLine="708"/>
+      </w:pPr>
+      <w:r>
+        <w:t>Создание пользовательских компонентов в Unity позволяет расширить функциональность стандартных компонентов и создать уникальные элементы игры.</w:t>
       </w:r>
     </w:p>
     <w:p>
@@ -7759,27 +7570,20 @@
         </w:numPr>
       </w:pPr>
       <w:r>
+        <w:lastRenderedPageBreak/>
         <w:t>Присоединение компонента к игровому объекту: после написания кода мы присоединяем компонент к игровому объекту, выбрав его в инспекторе Unity и перетащив скрипт на объект.</w:t>
       </w:r>
     </w:p>
     <w:p>
       <w:r>
         <w:tab/>
-      </w:r>
-      <w:r>
         <w:t xml:space="preserve">Создание пользовательских компонентов в Unity позволяет нам создать уникальные элементы игры и реализовать необходимые функции и поведения игровых объектов. </w:t>
       </w:r>
     </w:p>
     <w:p>
       <w:r>
         <w:tab/>
-        <w:t>В Unity</w:t>
-      </w:r>
-      <w:r>
-        <w:t xml:space="preserve"> многие</w:t>
-      </w:r>
-      <w:r>
-        <w:t xml:space="preserve"> пользовательские компоненты, как правило, наследуются от класса </w:t>
+        <w:t xml:space="preserve">В Unity многие пользовательские компоненты, как правило, наследуются от класса </w:t>
       </w:r>
       <w:r>
         <w:rPr>
@@ -7789,11 +7593,7 @@
         <w:t>MonoBehaviour</w:t>
       </w:r>
       <w:r>
-        <w:t xml:space="preserve">. Этот класс предоставляет базовую </w:t>
-      </w:r>
-      <w:r>
-        <w:lastRenderedPageBreak/>
-        <w:t>функциональность для работы с игровыми объектами (</w:t>
+        <w:t>. Этот класс предоставляет базовую функциональность для работы с игровыми объектами (</w:t>
       </w:r>
       <w:r>
         <w:rPr>
@@ -7859,10 +7659,7 @@
         <w:t>ScriptableObject</w:t>
       </w:r>
       <w:r>
-        <w:t xml:space="preserve"> используется для создания настраиваемых данных, которые определяют поведение физики объектов в игре. Например, это может быть конфигурация параметров, таких как масса, сила гравитации, трение, скорость движения или параметры прыжка. </w:t>
-      </w:r>
-      <w:r>
-        <w:t xml:space="preserve">Эти данные затем подключаются к компоненту, отвечающему за физику, что упрощает настройку и балансировку игры. Это особенно полезно в Unity, так как ScriptableObject позволяет хранить данные вне сцены, делая их централизованными и легко редактируемыми </w:t>
+        <w:t xml:space="preserve"> используется для создания настраиваемых данных, которые определяют поведение физики объектов в игре. Например, это может быть конфигурация параметров, таких как масса, сила гравитации, трение, скорость движения или параметры прыжка. Эти данные затем подключаются к компоненту, отвечающему за физику, что упрощает настройку и балансировку игры. Это особенно полезно в Unity, так как ScriptableObject позволяет хранить данные вне сцены, делая их централизованными и легко редактируемыми </w:t>
       </w:r>
       <w:proofErr w:type="gramStart"/>
       <w:r>
@@ -7870,10 +7667,7 @@
       </w:r>
       <w:proofErr w:type="gramEnd"/>
       <w:r>
-        <w:t xml:space="preserve">. </w:t>
-      </w:r>
-      <w:r>
-        <w:t>Использование ScriptableObject позволяет легко модифицировать и переиспользовать физические характеристики для различных объектов (например, игрока) без необходимости дублировать код.</w:t>
+        <w:t>. Использование ScriptableObject позволяет легко модифицировать и переиспользовать физические характеристики для различных объектов (например, игрока) без необходимости дублировать код.</w:t>
       </w:r>
     </w:p>
     <w:p>
@@ -7885,6 +7679,33 @@
     <w:p/>
     <w:p/>
     <w:p/>
+    <w:p>
+      <w:pPr>
+        <w:pStyle w:val="1"/>
+      </w:pPr>
+      <w:r>
+        <w:lastRenderedPageBreak/>
+        <w:t>Реализация</w:t>
+      </w:r>
+    </w:p>
+    <w:p>
+      <w:pPr>
+        <w:pStyle w:val="1"/>
+        <w:numPr>
+          <w:ilvl w:val="0"/>
+          <w:numId w:val="0"/>
+        </w:numPr>
+        <w:ind w:left="720"/>
+        <w:jc w:val="both"/>
+      </w:pPr>
+    </w:p>
+    <w:p>
+      <w:pPr>
+        <w:rPr>
+          <w:lang w:val="en-US"/>
+        </w:rPr>
+      </w:pPr>
+    </w:p>
     <w:sectPr>
       <w:pgSz w:w="11906" w:h="16838"/>
       <w:pgMar w:top="1134" w:right="850" w:bottom="1134" w:left="1701" w:header="708" w:footer="708" w:gutter="0"/>

</xml_diff>